<commit_message>
docs: upgrade architecture documentation specs and add vercel multi-service config
</commit_message>
<xml_diff>
--- a/logs/ArgoGuard_Architecture_Documentation.docx
+++ b/logs/ArgoGuard_Architecture_Documentation.docx
@@ -4,905 +4,3657 @@
   <w:body>
     <w:p>
       <w:pPr>
-        <w:spacing w:before="360" w:after="160"/>
+        <w:spacing w:before="0" w:after="800" w:line="276" w:lineRule="auto"/>
+      </w:pPr>
+    </w:p>
+    <w:tbl>
+      <w:tblPr>
+        <w:tblW w:type="auto" w:w="0"/>
+        <w:jc w:val="center"/>
+        <w:tblLook w:firstColumn="1" w:firstRow="1" w:lastColumn="0" w:lastRow="0" w:noHBand="0" w:noVBand="1" w:val="04A0"/>
+        <w:tblBorders>
+          <w:top w:val="none"/>
+          <w:left w:val="none"/>
+          <w:bottom w:val="none"/>
+          <w:right w:val="none"/>
+          <w:insideH w:val="none"/>
+          <w:insideV w:val="none"/>
+        </w:tblBorders>
+      </w:tblPr>
+      <w:tblGrid>
+        <w:gridCol w:w="9360"/>
+      </w:tblGrid>
+      <w:tr>
+        <w:tc>
+          <w:tcPr>
+            <w:tcW w:type="dxa" w:w="9360"/>
+            <w:shd w:fill="1B5E20"/>
+            <w:tcMar>
+              <w:top w:w="120" w:type="dxa"/>
+              <w:bottom w:w="120" w:type="dxa"/>
+              <w:left w:w="0" w:type="dxa"/>
+              <w:right w:w="0" w:type="dxa"/>
+            </w:tcMar>
+          </w:tcPr>
+          <w:p>
+            <w:pPr>
+              <w:jc w:val="center"/>
+            </w:pPr>
+            <w:r>
+              <w:rPr>
+                <w:rFonts w:ascii="Calibri" w:hAnsi="Calibri"/>
+                <w:b/>
+                <w:color w:val="FFFFFF"/>
+                <w:sz w:val="19"/>
+              </w:rPr>
+              <w:t>SYSTEM ARCHITECTURE SPECIFICATION</w:t>
+            </w:r>
+          </w:p>
+        </w:tc>
+      </w:tr>
+    </w:tbl>
+    <w:p>
+      <w:pPr>
+        <w:spacing w:before="0" w:after="360" w:line="276" w:lineRule="auto"/>
+      </w:pPr>
+    </w:p>
+    <w:p>
+      <w:pPr>
+        <w:spacing w:before="0" w:after="120" w:line="276" w:lineRule="auto"/>
+        <w:jc w:val="left"/>
       </w:pPr>
       <w:r>
         <w:rPr>
+          <w:rFonts w:ascii="Calibri Light" w:hAnsi="Calibri Light"/>
           <w:b/>
-          <w:color w:val="047857"/>
-          <w:sz w:val="40"/>
+          <w:color w:val="1B5E20"/>
+          <w:sz w:val="72"/>
         </w:rPr>
-        <w:t>ArgoGuard AI: Architecture &amp; Design Documentation</w:t>
+        <w:t>ArgoGuard AI</w:t>
       </w:r>
     </w:p>
     <w:p>
       <w:pPr>
-        <w:spacing w:after="120" w:line="276" w:lineRule="auto"/>
+        <w:spacing w:before="0" w:after="2400" w:line="276" w:lineRule="auto"/>
+        <w:jc w:val="left"/>
       </w:pPr>
       <w:r>
-        <w:t xml:space="preserve">This document provides a comprehensive overview of the design, architecture, integrations, and intelligent agent orchestrations that power the </w:t>
+        <w:rPr>
+          <w:rFonts w:ascii="Calibri Light" w:hAnsi="Calibri Light"/>
+          <w:color w:val="37474F"/>
+          <w:sz w:val="28"/>
+        </w:rPr>
+        <w:t>Intelligent Agricultural Co-Pilot &amp; Resiliency Cockpit</w:t>
+        <w:br/>
+        <w:t>Comprehensive Architecture &amp; Design Specification</w:t>
       </w:r>
+    </w:p>
+    <w:tbl>
+      <w:tblPr>
+        <w:tblW w:type="auto" w:w="0"/>
+        <w:tblLook w:firstColumn="1" w:firstRow="1" w:lastColumn="0" w:lastRow="0" w:noHBand="0" w:noVBand="1" w:val="04A0"/>
+        <w:tblBorders>
+          <w:top w:val="none"/>
+          <w:left w:val="none"/>
+          <w:bottom w:val="none"/>
+          <w:right w:val="none"/>
+          <w:insideH w:val="none"/>
+          <w:insideV w:val="none"/>
+        </w:tblBorders>
+      </w:tblPr>
+      <w:tblGrid>
+        <w:gridCol w:w="9360"/>
+      </w:tblGrid>
+      <w:tr>
+        <w:tc>
+          <w:tcPr>
+            <w:tcW w:type="dxa" w:w="9360"/>
+            <w:shd w:fill="81C784"/>
+            <w:tcMar>
+              <w:top w:w="10" w:type="dxa"/>
+              <w:bottom w:w="10" w:type="dxa"/>
+              <w:left w:w="0" w:type="dxa"/>
+              <w:right w:w="0" w:type="dxa"/>
+            </w:tcMar>
+            <w:cantSplit/>
+          </w:tcPr>
+          <w:p/>
+        </w:tc>
+      </w:tr>
+    </w:tbl>
+    <w:p>
+      <w:pPr>
+        <w:spacing w:before="0" w:after="800" w:line="276" w:lineRule="auto"/>
+      </w:pPr>
+    </w:p>
+    <w:tbl>
+      <w:tblPr>
+        <w:tblW w:type="auto" w:w="0"/>
+        <w:jc w:val="left"/>
+        <w:tblLook w:firstColumn="1" w:firstRow="1" w:lastColumn="0" w:lastRow="0" w:noHBand="0" w:noVBand="1" w:val="04A0"/>
+        <w:tblBorders>
+          <w:top w:val="single" w:sz="0" w:space="0" w:color="FFFFFF"/>
+          <w:left w:val="single" w:sz="0" w:space="0" w:color="FFFFFF"/>
+          <w:bottom w:val="single" w:sz="0" w:space="0" w:color="FFFFFF"/>
+          <w:right w:val="single" w:sz="0" w:space="0" w:color="FFFFFF"/>
+          <w:insideH w:val="single" w:sz="0" w:space="0" w:color="FFFFFF"/>
+          <w:insideV w:val="single" w:sz="0" w:space="0" w:color="FFFFFF"/>
+        </w:tblBorders>
+      </w:tblPr>
+      <w:tblGrid>
+        <w:gridCol w:w="4680"/>
+        <w:gridCol w:w="4680"/>
+      </w:tblGrid>
+      <w:tr>
+        <w:tc>
+          <w:tcPr>
+            <w:tcW w:type="dxa" w:w="2880"/>
+          </w:tcPr>
+          <w:p>
+            <w:r>
+              <w:rPr>
+                <w:b/>
+                <w:color w:val="37474F"/>
+                <w:sz w:val="19"/>
+              </w:rPr>
+              <w:t>Document Version:</w:t>
+            </w:r>
+          </w:p>
+        </w:tc>
+        <w:tc>
+          <w:tcPr>
+            <w:tcW w:type="dxa" w:w="6480"/>
+          </w:tcPr>
+          <w:p>
+            <w:r>
+              <w:rPr>
+                <w:color w:val="212121"/>
+                <w:sz w:val="19"/>
+              </w:rPr>
+              <w:t>1.0.0 (Production Stable)</w:t>
+            </w:r>
+          </w:p>
+        </w:tc>
+      </w:tr>
+      <w:tr>
+        <w:tc>
+          <w:tcPr>
+            <w:tcW w:type="dxa" w:w="2880"/>
+          </w:tcPr>
+          <w:p>
+            <w:r>
+              <w:rPr>
+                <w:b/>
+                <w:color w:val="37474F"/>
+                <w:sz w:val="19"/>
+              </w:rPr>
+              <w:t>Date of Publication:</w:t>
+            </w:r>
+          </w:p>
+        </w:tc>
+        <w:tc>
+          <w:tcPr>
+            <w:tcW w:type="dxa" w:w="6480"/>
+          </w:tcPr>
+          <w:p>
+            <w:r>
+              <w:rPr>
+                <w:color w:val="212121"/>
+                <w:sz w:val="19"/>
+              </w:rPr>
+              <w:t>May 20, 2026</w:t>
+            </w:r>
+          </w:p>
+        </w:tc>
+      </w:tr>
+      <w:tr>
+        <w:tc>
+          <w:tcPr>
+            <w:tcW w:type="dxa" w:w="2880"/>
+          </w:tcPr>
+          <w:p>
+            <w:r>
+              <w:rPr>
+                <w:b/>
+                <w:color w:val="37474F"/>
+                <w:sz w:val="19"/>
+              </w:rPr>
+              <w:t>Target System:</w:t>
+            </w:r>
+          </w:p>
+        </w:tc>
+        <w:tc>
+          <w:tcPr>
+            <w:tcW w:type="dxa" w:w="6480"/>
+          </w:tcPr>
+          <w:p>
+            <w:r>
+              <w:rPr>
+                <w:color w:val="212121"/>
+                <w:sz w:val="19"/>
+              </w:rPr>
+              <w:t>ArgoGuard Smart Core Infrastructure</w:t>
+            </w:r>
+          </w:p>
+        </w:tc>
+      </w:tr>
+      <w:tr>
+        <w:tc>
+          <w:tcPr>
+            <w:tcW w:type="dxa" w:w="2880"/>
+          </w:tcPr>
+          <w:p>
+            <w:r>
+              <w:rPr>
+                <w:b/>
+                <w:color w:val="37474F"/>
+                <w:sz w:val="19"/>
+              </w:rPr>
+              <w:t>Classification:</w:t>
+            </w:r>
+          </w:p>
+        </w:tc>
+        <w:tc>
+          <w:tcPr>
+            <w:tcW w:type="dxa" w:w="6480"/>
+          </w:tcPr>
+          <w:p>
+            <w:r>
+              <w:rPr>
+                <w:color w:val="212121"/>
+                <w:sz w:val="19"/>
+              </w:rPr>
+              <w:t>Internal Engineering Specification</w:t>
+            </w:r>
+          </w:p>
+        </w:tc>
+      </w:tr>
+    </w:tbl>
+    <w:p>
       <w:r>
-        <w:rPr>
-          <w:b/>
-        </w:rPr>
-        <w:t>ArgoGuard AI</w:t>
-      </w:r>
-      <w:r>
-        <w:t xml:space="preserve"> platform.</w:t>
+        <w:br w:type="page"/>
       </w:r>
     </w:p>
     <w:p>
       <w:pPr>
-        <w:pStyle w:val="ListBullet"/>
-        <w:spacing w:after="60"/>
+        <w:pStyle w:val="Heading1"/>
+        <w:keepNext/>
+        <w:spacing w:before="440" w:after="200"/>
       </w:pPr>
       <w:r>
-        <w:t>--</w:t>
+        <w:rPr>
+          <w:rFonts w:ascii="Calibri Light" w:hAnsi="Calibri Light"/>
+          <w:b/>
+          <w:color w:val="1B5E20"/>
+          <w:sz w:val="40"/>
+        </w:rPr>
+        <w:t>1. Solution Overview</w:t>
       </w:r>
     </w:p>
     <w:p>
       <w:pPr>
-        <w:spacing w:before="280" w:after="120"/>
+        <w:spacing w:before="0" w:after="120" w:line="276" w:lineRule="auto"/>
       </w:pPr>
       <w:r>
-        <w:rPr>
-          <w:b/>
-          <w:color w:val="0F172A"/>
-          <w:sz w:val="30"/>
-        </w:rPr>
-        <w:t>1. Overall Solution Overview</w:t>
+        <w:t>ArgoGuard AI is an advanced, enterprise-grade smart farming ecosystem and dual-frontend intelligent co-pilot. Engineered to bridge the operational gap between digital cloud analysis and physical field management, the platform coordinates multimodal computer vision, live meteorological feeds, automated IoT field hardware, and transactional state overrides. ArgoGuard AI safeguards crops, optimizes irrigation, and ensures agricultural operational resilience.</w:t>
       </w:r>
     </w:p>
     <w:p>
       <w:pPr>
-        <w:pStyle w:val="ListBullet"/>
-        <w:spacing w:after="60"/>
+        <w:spacing w:before="0" w:after="120" w:line="276" w:lineRule="auto"/>
       </w:pPr>
       <w:r>
-        <w:t>*ArgoGuard AI** is an advanced, AI-driven agricultural assistant platform designed to provide end-to-end crop management for farmers. It bridges the gap between digital AI analysis and physical farm operations.</w:t>
+        <w:t>By integrating the power of high-confidence multi-agent reasoning with real-time feedback loops, the platform actively mitigates risk. Farm operators receive continuous visual and structural assurance that treatments are perfectly aligned with dynamic weather requirements and that physical hardware faults will never compromise field stability.</w:t>
+      </w:r>
+    </w:p>
+    <w:tbl>
+      <w:tblPr>
+        <w:tblW w:type="auto" w:w="0"/>
+        <w:jc w:val="center"/>
+        <w:tblLayout w:type="fixed"/>
+        <w:tblLook w:firstColumn="1" w:firstRow="1" w:lastColumn="0" w:lastRow="0" w:noHBand="0" w:noVBand="1" w:val="04A0"/>
+        <w:tblBorders>
+          <w:left w:val="single" w:sz="36" w:space="0" w:color="1B5E20"/>
+          <w:top w:val="none"/>
+          <w:bottom w:val="none"/>
+          <w:right w:val="none"/>
+          <w:insideH w:val="none"/>
+          <w:insideV w:val="none"/>
+        </w:tblBorders>
+      </w:tblPr>
+      <w:tblGrid>
+        <w:gridCol w:w="9360"/>
+      </w:tblGrid>
+      <w:tr>
+        <w:tc>
+          <w:tcPr>
+            <w:tcW w:type="dxa" w:w="9360"/>
+            <w:shd w:fill="E8F5E9"/>
+            <w:tcMar>
+              <w:top w:w="140" w:type="dxa"/>
+              <w:bottom w:w="140" w:type="dxa"/>
+              <w:left w:w="200" w:type="dxa"/>
+              <w:right w:w="200" w:type="dxa"/>
+            </w:tcMar>
+          </w:tcPr>
+          <w:p>
+            <w:pPr>
+              <w:spacing w:before="40" w:after="80"/>
+            </w:pPr>
+            <w:r>
+              <w:rPr>
+                <w:rFonts w:ascii="Calibri" w:hAnsi="Calibri"/>
+                <w:b/>
+                <w:color w:val="1B5E20"/>
+                <w:sz w:val="22"/>
+              </w:rPr>
+              <w:t>🛡️ Core Value Proposition</w:t>
+            </w:r>
+          </w:p>
+          <w:p>
+            <w:pPr>
+              <w:spacing w:before="0" w:after="80" w:line="276" w:lineRule="auto"/>
+            </w:pPr>
+            <w:r>
+              <w:rPr>
+                <w:rFonts w:ascii="Calibri" w:hAnsi="Calibri"/>
+                <w:color w:val="212121"/>
+                <w:sz w:val="20"/>
+              </w:rPr>
+              <w:t>Intelligent Diagnostics: Leverages Google Gemini Multimodal APIs to analyze visual pathology with expert-level precision.</w:t>
+            </w:r>
+          </w:p>
+          <w:p>
+            <w:pPr>
+              <w:spacing w:before="0" w:after="80" w:line="276" w:lineRule="auto"/>
+            </w:pPr>
+            <w:r>
+              <w:rPr>
+                <w:rFonts w:ascii="Calibri" w:hAnsi="Calibri"/>
+                <w:color w:val="212121"/>
+                <w:sz w:val="20"/>
+              </w:rPr>
+              <w:t>Contextual Safety: Overrides irrigation and spray treatments dynamically if local weather signals pose contagion or run-off risks.</w:t>
+            </w:r>
+          </w:p>
+          <w:p>
+            <w:pPr>
+              <w:spacing w:before="0" w:after="40" w:line="276" w:lineRule="auto"/>
+            </w:pPr>
+            <w:r>
+              <w:rPr>
+                <w:rFonts w:ascii="Calibri" w:hAnsi="Calibri"/>
+                <w:color w:val="212121"/>
+                <w:sz w:val="20"/>
+              </w:rPr>
+              <w:t>Transactional Failsafes: Restores stable hardware baselines automatically in the event of controller connection drops, avoiding toxic over-spraying.</w:t>
+            </w:r>
+          </w:p>
+        </w:tc>
+      </w:tr>
+    </w:tbl>
+    <w:p>
+      <w:pPr>
+        <w:spacing w:before="0" w:after="160"/>
+      </w:pPr>
+    </w:p>
+    <w:p>
+      <w:pPr>
+        <w:pStyle w:val="Heading1"/>
+        <w:keepNext/>
+        <w:spacing w:before="440" w:after="200"/>
+      </w:pPr>
+      <w:r>
+        <w:rPr>
+          <w:rFonts w:ascii="Calibri Light" w:hAnsi="Calibri Light"/>
+          <w:b/>
+          <w:color w:val="1B5E20"/>
+          <w:sz w:val="40"/>
+        </w:rPr>
+        <w:t>2. Decoupled Client-Server Architecture</w:t>
       </w:r>
     </w:p>
     <w:p>
       <w:pPr>
-        <w:spacing w:after="120" w:line="276" w:lineRule="auto"/>
+        <w:spacing w:before="0" w:after="120" w:line="276" w:lineRule="auto"/>
       </w:pPr>
       <w:r>
-        <w:t>The system allows farmers to upload images of their crops, which are analyzed by a multi-agent orchestration engine. This engine doesn't just diagnose diseases; it assesses environmental risks, plans safe treatments, coordinates hardware actions (like smart sprinklers or pesticide drones), and features robust failsafe mechanisms to revert operations if hardware errors occur.</w:t>
+        <w:t>The system architecture is structured as a robust, decoupled three-tier pattern. This isolates frontend presentation layers from the orchestrator logic and state management services, ensuring high horizontal scalability and offline reliability.</w:t>
       </w:r>
     </w:p>
     <w:p>
       <w:pPr>
-        <w:pStyle w:val="ListBullet"/>
-        <w:spacing w:after="60"/>
+        <w:pStyle w:val="Heading2"/>
+        <w:keepNext/>
+        <w:spacing w:before="320" w:after="160"/>
       </w:pPr>
       <w:r>
-        <w:t>--</w:t>
+        <w:rPr>
+          <w:rFonts w:ascii="Calibri Light" w:hAnsi="Calibri Light"/>
+          <w:b/>
+          <w:color w:val="37474F"/>
+          <w:sz w:val="28"/>
+        </w:rPr>
+        <w:t>2.1 System Architecture Flow</w:t>
+      </w:r>
+    </w:p>
+    <w:tbl>
+      <w:tblPr>
+        <w:tblW w:type="auto" w:w="0"/>
+        <w:jc w:val="center"/>
+        <w:tblLayout w:type="fixed"/>
+        <w:tblLook w:firstColumn="1" w:firstRow="1" w:lastColumn="0" w:lastRow="0" w:noHBand="0" w:noVBand="1" w:val="04A0"/>
+        <w:tblBorders>
+          <w:top w:val="single" w:sz="4" w:space="0" w:color="CFD8DC"/>
+          <w:left w:val="single" w:sz="4" w:space="0" w:color="CFD8DC"/>
+          <w:bottom w:val="single" w:sz="4" w:space="0" w:color="CFD8DC"/>
+          <w:right w:val="single" w:sz="4" w:space="0" w:color="CFD8DC"/>
+          <w:insideH w:val="single" w:sz="4" w:space="0" w:color="CFD8DC"/>
+          <w:insideV w:val="single" w:sz="4" w:space="0" w:color="CFD8DC"/>
+        </w:tblBorders>
+      </w:tblPr>
+      <w:tblGrid>
+        <w:gridCol w:w="9360"/>
+      </w:tblGrid>
+      <w:tr>
+        <w:tc>
+          <w:tcPr>
+            <w:tcW w:type="dxa" w:w="9360"/>
+            <w:shd w:fill="ECEFF1"/>
+            <w:tcMar>
+              <w:top w:w="120" w:type="dxa"/>
+              <w:bottom w:w="120" w:type="dxa"/>
+              <w:left w:w="160" w:type="dxa"/>
+              <w:right w:w="160" w:type="dxa"/>
+            </w:tcMar>
+          </w:tcPr>
+          <w:p>
+            <w:pPr>
+              <w:spacing w:before="40" w:after="40" w:line="240" w:lineRule="auto"/>
+            </w:pPr>
+            <w:r>
+              <w:rPr>
+                <w:rFonts w:ascii="Consolas" w:hAnsi="Consolas"/>
+                <w:color w:val="263238"/>
+                <w:sz w:val="17"/>
+              </w:rPr>
+              <w:t>┌────────────────────────────────────────────────────────────────────────┐</w:t>
+              <w:br/>
+              <w:t>│                             USER INTERFACES                            │</w:t>
+              <w:br/>
+              <w:t>│  💻 React Web Dashboard Cockpit        📱 Flutter Mobile App            │</w:t>
+              <w:br/>
+              <w:t>│  (Command &amp; Control Center)            (On-Field Operations Scanner)   │</w:t>
+              <w:br/>
+              <w:t>└───────────────────┬──────────────────────────────────┬─────────────────┘</w:t>
+              <w:br/>
+              <w:t xml:space="preserve">                    │                                  │                  </w:t>
+              <w:br/>
+              <w:t xml:space="preserve">                    │  REST API Payloads / JWT Auth   │                  </w:t>
+              <w:br/>
+              <w:t xml:space="preserve">                    ▼                                  ▼                  </w:t>
+              <w:br/>
+              <w:t>┌────────────────────────────────────────────────────────────────────────┐</w:t>
+              <w:br/>
+              <w:t>│                       🧠 Express Server Controller                     │</w:t>
+              <w:br/>
+              <w:t>│       Validates Tokens, Parses Image Uploads, Coordinates Modules       │</w:t>
+              <w:br/>
+              <w:t>└───────┬──────────────────┬─────────────────┬───────────────────┬───────┘</w:t>
+              <w:br/>
+              <w:t xml:space="preserve">        │                  │                 │                   │        </w:t>
+              <w:br/>
+              <w:t xml:space="preserve">        ▼                  ▼                 ▼                   ▼        </w:t>
+              <w:br/>
+              <w:t xml:space="preserve">┌──────────────┐   ┌──────────────┐  ┌──────────────┐    ┌──────────────┐ </w:t>
+              <w:br/>
+              <w:t xml:space="preserve">│ 🤖 6-Agent   │   │ 🌤️ Weather  │  │ ⚖️ Constraint │    │ 🛡️ Failsafe  │ </w:t>
+              <w:br/>
+              <w:t xml:space="preserve">│ Orchestrator │   │ API Service  │  │ Resolution   │    │ Recovery     │ </w:t>
+              <w:br/>
+              <w:t xml:space="preserve">│ (Diagnostics)│   │ (Open-Meteo) │  │ Override     │    │ (Rollbacks)  │ </w:t>
+              <w:br/>
+              <w:t xml:space="preserve">└──────┬───────┘   └──────────────┘  └──────────────┘    └───────┬──────┘ </w:t>
+              <w:br/>
+              <w:t xml:space="preserve">       │                                                         │        </w:t>
+              <w:br/>
+              <w:t xml:space="preserve">       ▼                                                         ▼        </w:t>
+              <w:br/>
+              <w:t>┌─────────────────────────┐                             ┌────────────────┐</w:t>
+              <w:br/>
+              <w:t>│  💾 MONGODB DATASTORE   │                             │  🚜 PHYSICAL   │</w:t>
+              <w:br/>
+              <w:t>│  (Accounts &amp; Telemetry) │                             │   ACTUATOR IoT │</w:t>
+              <w:br/>
+              <w:t>└─────────────────────────┘                             └────────────────┘</w:t>
+            </w:r>
+          </w:p>
+        </w:tc>
+      </w:tr>
+    </w:tbl>
+    <w:p>
+      <w:pPr>
+        <w:spacing w:before="0" w:after="160"/>
+      </w:pPr>
+    </w:p>
+    <w:p>
+      <w:pPr>
+        <w:spacing w:before="0" w:after="120" w:line="276" w:lineRule="auto"/>
+      </w:pPr>
+      <w:r>
+        <w:t>For reference, developers can easily render the high-fidelity diagram using the following Mermaid notation:</w:t>
+      </w:r>
+    </w:p>
+    <w:tbl>
+      <w:tblPr>
+        <w:tblW w:type="auto" w:w="0"/>
+        <w:jc w:val="center"/>
+        <w:tblLayout w:type="fixed"/>
+        <w:tblLook w:firstColumn="1" w:firstRow="1" w:lastColumn="0" w:lastRow="0" w:noHBand="0" w:noVBand="1" w:val="04A0"/>
+        <w:tblBorders>
+          <w:top w:val="single" w:sz="4" w:space="0" w:color="CFD8DC"/>
+          <w:left w:val="single" w:sz="4" w:space="0" w:color="CFD8DC"/>
+          <w:bottom w:val="single" w:sz="4" w:space="0" w:color="CFD8DC"/>
+          <w:right w:val="single" w:sz="4" w:space="0" w:color="CFD8DC"/>
+          <w:insideH w:val="single" w:sz="4" w:space="0" w:color="CFD8DC"/>
+          <w:insideV w:val="single" w:sz="4" w:space="0" w:color="CFD8DC"/>
+        </w:tblBorders>
+      </w:tblPr>
+      <w:tblGrid>
+        <w:gridCol w:w="9360"/>
+      </w:tblGrid>
+      <w:tr>
+        <w:tc>
+          <w:tcPr>
+            <w:tcW w:type="dxa" w:w="9360"/>
+            <w:shd w:fill="ECEFF1"/>
+            <w:tcMar>
+              <w:top w:w="120" w:type="dxa"/>
+              <w:bottom w:w="120" w:type="dxa"/>
+              <w:left w:w="160" w:type="dxa"/>
+              <w:right w:w="160" w:type="dxa"/>
+            </w:tcMar>
+          </w:tcPr>
+          <w:p>
+            <w:pPr>
+              <w:spacing w:before="40" w:after="40" w:line="240" w:lineRule="auto"/>
+            </w:pPr>
+            <w:r>
+              <w:rPr>
+                <w:rFonts w:ascii="Consolas" w:hAnsi="Consolas"/>
+                <w:color w:val="263238"/>
+                <w:sz w:val="17"/>
+              </w:rPr>
+              <w:t>graph TD</w:t>
+              <w:br/>
+              <w:t xml:space="preserve">    WebDashboard["💻 React Web Dashboard (Cockpit)"] &lt;--&gt; ExpressServer["🧠 Express Server"]</w:t>
+              <w:br/>
+              <w:t xml:space="preserve">    MobileApp["📱 Flutter Mobile App (On-Field)"] &lt;--&gt; ExpressServer</w:t>
+              <w:br/>
+              <w:t xml:space="preserve">    ExpressServer &lt;--&gt; MongoDB[("💾 MongoDB Datastore")]</w:t>
+              <w:br/>
+              <w:t xml:space="preserve">    ExpressServer &lt;--&gt; AgentOrchestrator["🤖 6-Agent Orchestrator"]</w:t>
+              <w:br/>
+              <w:t xml:space="preserve">    ExpressServer &lt;--&gt; WeatherService["🌤️ Weather Intelligence"]</w:t>
+              <w:br/>
+              <w:t xml:space="preserve">    ExpressServer &lt;--&gt; ContradictionService["⚖️ Contradiction Resolution"]</w:t>
+              <w:br/>
+              <w:t xml:space="preserve">    ExpressServer &lt;--&gt; FailsafeEngine["🛡️ Failsafe &amp; Recovery"]</w:t>
+            </w:r>
+          </w:p>
+        </w:tc>
+      </w:tr>
+    </w:tbl>
+    <w:p>
+      <w:pPr>
+        <w:spacing w:before="0" w:after="160"/>
+      </w:pPr>
+    </w:p>
+    <w:p>
+      <w:pPr>
+        <w:pStyle w:val="Heading2"/>
+        <w:keepNext/>
+        <w:spacing w:before="320" w:after="160"/>
+      </w:pPr>
+      <w:r>
+        <w:rPr>
+          <w:rFonts w:ascii="Calibri Light" w:hAnsi="Calibri Light"/>
+          <w:b/>
+          <w:color w:val="37474F"/>
+          <w:sz w:val="28"/>
+        </w:rPr>
+        <w:t>2.2 Subsystem Details</w:t>
       </w:r>
     </w:p>
     <w:p>
       <w:pPr>
-        <w:spacing w:before="280" w:after="120"/>
+        <w:pStyle w:val="Heading3"/>
+        <w:keepNext/>
+        <w:spacing w:before="240" w:after="120"/>
       </w:pPr>
       <w:r>
         <w:rPr>
+          <w:rFonts w:ascii="Calibri" w:hAnsi="Calibri"/>
           <w:b/>
-          <w:color w:val="0F172A"/>
-          <w:sz w:val="30"/>
+          <w:i/>
+          <w:color w:val="558B2F"/>
+          <w:sz w:val="23"/>
         </w:rPr>
-        <w:t>2. Brief Overview of Architecture</w:t>
+        <w:t>A. React Web Dashboard Cockpit</w:t>
       </w:r>
     </w:p>
     <w:p>
       <w:pPr>
-        <w:spacing w:after="120" w:line="276" w:lineRule="auto"/>
+        <w:spacing w:before="0" w:after="120" w:line="276" w:lineRule="auto"/>
       </w:pPr>
       <w:r>
-        <w:t>The system follows a classic decoupled client-server architecture:</w:t>
+        <w:t xml:space="preserve">Located inside the '/frontend' folder, this client represents the command cockpit for smart farm managers. Designed with React v19, Vite, and Tailwind CSS v4, it provides: </w:t>
+        <w:br/>
+        <w:t>•  Secure Credentials &amp; Multi-Factor Auth: Standard email signups integrated with a 6-digit MFA OTP system. Includes Google &amp; Facebook OAuth buttons mapping to social backend controllers.</w:t>
+        <w:br/>
+        <w:t>•  6-Agent Diagnostics Sandbox: A terminal execution sandbox showing raw steps, Gemini reasoning, constraint planning, and physical rollback actions in real time.</w:t>
+        <w:br/>
+        <w:t>•  Treatment Simulators: Side-by-side split visual comparison sliders showing pathological foliage before and after treatment to model recovery dynamics.</w:t>
+        <w:br/>
+        <w:t>•  Hardware Simulation Panel: Interactive knobs allowing developers and users to toggle network latency, supplier timeouts, and database dropouts to watch failsafes execute.</w:t>
       </w:r>
     </w:p>
     <w:p>
       <w:pPr>
-        <w:spacing w:before="200" w:after="80"/>
+        <w:pStyle w:val="Heading3"/>
+        <w:keepNext/>
+        <w:spacing w:before="240" w:after="120"/>
       </w:pPr>
       <w:r>
         <w:rPr>
+          <w:rFonts w:ascii="Calibri" w:hAnsi="Calibri"/>
           <w:b/>
-          <w:color w:val="10B981"/>
-          <w:sz w:val="25"/>
+          <w:i/>
+          <w:color w:val="558B2F"/>
+          <w:sz w:val="23"/>
         </w:rPr>
-        <w:t>Frontend Clients (Dual-Client Architectures)</w:t>
+        <w:t>B. Flutter Mobile App</w:t>
       </w:r>
     </w:p>
     <w:p>
       <w:pPr>
-        <w:spacing w:after="120" w:line="276" w:lineRule="auto"/>
+        <w:spacing w:before="0" w:after="120" w:line="276" w:lineRule="auto"/>
       </w:pPr>
       <w:r>
-        <w:t>The ecosystem provides two specialized frontend clients targeting different operational use cases:</w:t>
+        <w:t xml:space="preserve">Located in the workspace root, the Flutter mobile app is the physical field companion for farm workers: </w:t>
+        <w:br/>
+        <w:t>•  Provider State Architecture: Built with reactive Providers (AuthProvider, AnalysisProvider, WeatherProvider) to ensure UI elements update instantly.</w:t>
+        <w:br/>
+        <w:t>•  Camera Scanner Uploads: Direct device camera captures are streamed via multipart form-data to the backend for Gemini Vision classification.</w:t>
+        <w:br/>
+        <w:t>•  Location Weather Alerts: Leverages geolocator plugins to query local Open-Meteo indices and alert workers of high pesticide run-off risks before they spray.</w:t>
+        <w:br/>
+        <w:t>•  Local Caching: Caches diagnostic history locally so features remain available in low-connectivity areas.</w:t>
       </w:r>
     </w:p>
     <w:p>
       <w:pPr>
-        <w:spacing w:before="160" w:after="40"/>
+        <w:pStyle w:val="Heading1"/>
+        <w:keepNext/>
+        <w:spacing w:before="440" w:after="200"/>
       </w:pPr>
       <w:r>
         <w:rPr>
+          <w:rFonts w:ascii="Calibri Light" w:hAnsi="Calibri Light"/>
           <w:b/>
-          <w:i/>
-          <w:color w:val="334155"/>
-          <w:sz w:val="22"/>
+          <w:color w:val="1B5E20"/>
+          <w:sz w:val="40"/>
         </w:rPr>
-        <w:t>A. 💻 React Web Dashboard Cockpit (Located inside `/frontend`)</w:t>
+        <w:t>3. The 6-Agent Diagnostic Orchestrator</w:t>
       </w:r>
     </w:p>
     <w:p>
       <w:pPr>
-        <w:pStyle w:val="ListBullet"/>
-        <w:spacing w:after="60"/>
+        <w:spacing w:before="0" w:after="120" w:line="276" w:lineRule="auto"/>
       </w:pPr>
-      <w:r/>
+      <w:r>
+        <w:t>The flagship service in the ArgoGuard AI backend is the custom Multi-Agent Orchestrator (multi_agent_orchestrator.js). To make sound decisions, the orchestrator divides critical tasks into a sequence of six specialized reasoning steps. This ensures transparent, auditable decision paths:</w:t>
+      </w:r>
+    </w:p>
+    <w:tbl>
+      <w:tblPr>
+        <w:tblW w:type="auto" w:w="0"/>
+        <w:jc w:val="center"/>
+        <w:tblLayout w:type="fixed"/>
+        <w:tblLook w:firstColumn="1" w:firstRow="1" w:lastColumn="0" w:lastRow="0" w:noHBand="0" w:noVBand="1" w:val="04A0"/>
+        <w:tblBorders>
+          <w:top w:val="single" w:sz="4" w:space="0" w:color="D1D8D1"/>
+          <w:left w:val="single" w:sz="4" w:space="0" w:color="D1D8D1"/>
+          <w:bottom w:val="single" w:sz="4" w:space="0" w:color="D1D8D1"/>
+          <w:right w:val="single" w:sz="4" w:space="0" w:color="D1D8D1"/>
+          <w:insideH w:val="single" w:sz="4" w:space="0" w:color="D1D8D1"/>
+          <w:insideV w:val="single" w:sz="4" w:space="0" w:color="D1D8D1"/>
+        </w:tblBorders>
+      </w:tblPr>
+      <w:tblGrid>
+        <w:gridCol w:w="864"/>
+        <w:gridCol w:w="2016"/>
+        <w:gridCol w:w="3600"/>
+        <w:gridCol w:w="2880"/>
+      </w:tblGrid>
+      <w:tr>
+        <w:trPr>
+          <w:tblHeader/>
+          <w:cantSplit/>
+        </w:trPr>
+        <w:tc>
+          <w:tcPr>
+            <w:tcW w:type="dxa" w:w="864"/>
+            <w:shd w:fill="1B5E20"/>
+            <w:tcMar>
+              <w:top w:w="160" w:type="dxa"/>
+              <w:bottom w:w="160" w:type="dxa"/>
+              <w:left w:w="120" w:type="dxa"/>
+              <w:right w:w="120" w:type="dxa"/>
+            </w:tcMar>
+          </w:tcPr>
+          <w:p>
+            <w:pPr>
+              <w:spacing w:before="40" w:after="40"/>
+              <w:jc w:val="left"/>
+            </w:pPr>
+            <w:r>
+              <w:rPr>
+                <w:rFonts w:ascii="Calibri" w:hAnsi="Calibri"/>
+                <w:b/>
+                <w:color w:val="FFFFFF"/>
+                <w:sz w:val="20"/>
+              </w:rPr>
+              <w:t>Step</w:t>
+            </w:r>
+          </w:p>
+        </w:tc>
+        <w:tc>
+          <w:tcPr>
+            <w:tcW w:type="dxa" w:w="2016"/>
+            <w:shd w:fill="1B5E20"/>
+            <w:tcMar>
+              <w:top w:w="160" w:type="dxa"/>
+              <w:bottom w:w="160" w:type="dxa"/>
+              <w:left w:w="120" w:type="dxa"/>
+              <w:right w:w="120" w:type="dxa"/>
+            </w:tcMar>
+          </w:tcPr>
+          <w:p>
+            <w:pPr>
+              <w:spacing w:before="40" w:after="40"/>
+              <w:jc w:val="left"/>
+            </w:pPr>
+            <w:r>
+              <w:rPr>
+                <w:rFonts w:ascii="Calibri" w:hAnsi="Calibri"/>
+                <w:b/>
+                <w:color w:val="FFFFFF"/>
+                <w:sz w:val="20"/>
+              </w:rPr>
+              <w:t>Agent Name</w:t>
+            </w:r>
+          </w:p>
+        </w:tc>
+        <w:tc>
+          <w:tcPr>
+            <w:tcW w:type="dxa" w:w="3600"/>
+            <w:shd w:fill="1B5E20"/>
+            <w:tcMar>
+              <w:top w:w="160" w:type="dxa"/>
+              <w:bottom w:w="160" w:type="dxa"/>
+              <w:left w:w="120" w:type="dxa"/>
+              <w:right w:w="120" w:type="dxa"/>
+            </w:tcMar>
+          </w:tcPr>
+          <w:p>
+            <w:pPr>
+              <w:spacing w:before="40" w:after="40"/>
+              <w:jc w:val="left"/>
+            </w:pPr>
+            <w:r>
+              <w:rPr>
+                <w:rFonts w:ascii="Calibri" w:hAnsi="Calibri"/>
+                <w:b/>
+                <w:color w:val="FFFFFF"/>
+                <w:sz w:val="20"/>
+              </w:rPr>
+              <w:t>Primary Domain Responsibility</w:t>
+            </w:r>
+          </w:p>
+        </w:tc>
+        <w:tc>
+          <w:tcPr>
+            <w:tcW w:type="dxa" w:w="2880"/>
+            <w:shd w:fill="1B5E20"/>
+            <w:tcMar>
+              <w:top w:w="160" w:type="dxa"/>
+              <w:bottom w:w="160" w:type="dxa"/>
+              <w:left w:w="120" w:type="dxa"/>
+              <w:right w:w="120" w:type="dxa"/>
+            </w:tcMar>
+          </w:tcPr>
+          <w:p>
+            <w:pPr>
+              <w:spacing w:before="40" w:after="40"/>
+              <w:jc w:val="left"/>
+            </w:pPr>
+            <w:r>
+              <w:rPr>
+                <w:rFonts w:ascii="Calibri" w:hAnsi="Calibri"/>
+                <w:b/>
+                <w:color w:val="FFFFFF"/>
+                <w:sz w:val="20"/>
+              </w:rPr>
+              <w:t>Data I/O Mapping</w:t>
+            </w:r>
+          </w:p>
+        </w:tc>
+      </w:tr>
+      <w:tr>
+        <w:trPr>
+          <w:cantSplit/>
+        </w:trPr>
+        <w:tc>
+          <w:tcPr>
+            <w:tcW w:type="dxa" w:w="864"/>
+            <w:shd w:fill="F8FAF8"/>
+            <w:tcMar>
+              <w:top w:w="120" w:type="dxa"/>
+              <w:bottom w:w="120" w:type="dxa"/>
+              <w:left w:w="120" w:type="dxa"/>
+              <w:right w:w="120" w:type="dxa"/>
+            </w:tcMar>
+          </w:tcPr>
+          <w:p>
+            <w:pPr>
+              <w:spacing w:before="40" w:after="40" w:line="264" w:lineRule="auto"/>
+              <w:jc w:val="left"/>
+            </w:pPr>
+            <w:r>
+              <w:rPr>
+                <w:rFonts w:ascii="Calibri" w:hAnsi="Calibri"/>
+                <w:color w:val="212121"/>
+                <w:sz w:val="19"/>
+              </w:rPr>
+              <w:t>1</w:t>
+            </w:r>
+          </w:p>
+        </w:tc>
+        <w:tc>
+          <w:tcPr>
+            <w:tcW w:type="dxa" w:w="2016"/>
+            <w:shd w:fill="F8FAF8"/>
+            <w:tcMar>
+              <w:top w:w="120" w:type="dxa"/>
+              <w:bottom w:w="120" w:type="dxa"/>
+              <w:left w:w="120" w:type="dxa"/>
+              <w:right w:w="120" w:type="dxa"/>
+            </w:tcMar>
+          </w:tcPr>
+          <w:p>
+            <w:pPr>
+              <w:spacing w:before="40" w:after="40" w:line="264" w:lineRule="auto"/>
+              <w:jc w:val="left"/>
+            </w:pPr>
+            <w:r>
+              <w:rPr>
+                <w:rFonts w:ascii="Calibri" w:hAnsi="Calibri"/>
+                <w:color w:val="212121"/>
+                <w:sz w:val="19"/>
+              </w:rPr>
+              <w:t>Input Aggregator</w:t>
+            </w:r>
+          </w:p>
+        </w:tc>
+        <w:tc>
+          <w:tcPr>
+            <w:tcW w:type="dxa" w:w="3600"/>
+            <w:shd w:fill="F8FAF8"/>
+            <w:tcMar>
+              <w:top w:w="120" w:type="dxa"/>
+              <w:bottom w:w="120" w:type="dxa"/>
+              <w:left w:w="120" w:type="dxa"/>
+              <w:right w:w="120" w:type="dxa"/>
+            </w:tcMar>
+          </w:tcPr>
+          <w:p>
+            <w:pPr>
+              <w:spacing w:before="40" w:after="40" w:line="264" w:lineRule="auto"/>
+              <w:jc w:val="left"/>
+            </w:pPr>
+            <w:r>
+              <w:rPr>
+                <w:rFonts w:ascii="Calibri" w:hAnsi="Calibri"/>
+                <w:color w:val="212121"/>
+                <w:sz w:val="19"/>
+              </w:rPr>
+              <w:t>Collects telemetry fields, matches crop image files, and polls local geolocation sensors.</w:t>
+            </w:r>
+          </w:p>
+        </w:tc>
+        <w:tc>
+          <w:tcPr>
+            <w:tcW w:type="dxa" w:w="2880"/>
+            <w:shd w:fill="F8FAF8"/>
+            <w:tcMar>
+              <w:top w:w="120" w:type="dxa"/>
+              <w:bottom w:w="120" w:type="dxa"/>
+              <w:left w:w="120" w:type="dxa"/>
+              <w:right w:w="120" w:type="dxa"/>
+            </w:tcMar>
+          </w:tcPr>
+          <w:p>
+            <w:pPr>
+              <w:spacing w:before="40" w:after="40" w:line="264" w:lineRule="auto"/>
+              <w:jc w:val="left"/>
+            </w:pPr>
+            <w:r>
+              <w:rPr>
+                <w:rFonts w:ascii="Calibri" w:hAnsi="Calibri"/>
+                <w:color w:val="212121"/>
+                <w:sz w:val="19"/>
+              </w:rPr>
+              <w:t>Input: Image file, coordinates</w:t>
+              <w:br/>
+              <w:t>Output: Unified JSON payload</w:t>
+            </w:r>
+          </w:p>
+        </w:tc>
+      </w:tr>
+      <w:tr>
+        <w:trPr>
+          <w:cantSplit/>
+        </w:trPr>
+        <w:tc>
+          <w:tcPr>
+            <w:tcW w:type="dxa" w:w="864"/>
+            <w:shd w:fill="FFFFFF"/>
+            <w:tcMar>
+              <w:top w:w="120" w:type="dxa"/>
+              <w:bottom w:w="120" w:type="dxa"/>
+              <w:left w:w="120" w:type="dxa"/>
+              <w:right w:w="120" w:type="dxa"/>
+            </w:tcMar>
+          </w:tcPr>
+          <w:p>
+            <w:pPr>
+              <w:spacing w:before="40" w:after="40" w:line="264" w:lineRule="auto"/>
+              <w:jc w:val="left"/>
+            </w:pPr>
+            <w:r>
+              <w:rPr>
+                <w:rFonts w:ascii="Calibri" w:hAnsi="Calibri"/>
+                <w:color w:val="212121"/>
+                <w:sz w:val="19"/>
+              </w:rPr>
+              <w:t>2</w:t>
+            </w:r>
+          </w:p>
+        </w:tc>
+        <w:tc>
+          <w:tcPr>
+            <w:tcW w:type="dxa" w:w="2016"/>
+            <w:shd w:fill="FFFFFF"/>
+            <w:tcMar>
+              <w:top w:w="120" w:type="dxa"/>
+              <w:bottom w:w="120" w:type="dxa"/>
+              <w:left w:w="120" w:type="dxa"/>
+              <w:right w:w="120" w:type="dxa"/>
+            </w:tcMar>
+          </w:tcPr>
+          <w:p>
+            <w:pPr>
+              <w:spacing w:before="40" w:after="40" w:line="264" w:lineRule="auto"/>
+              <w:jc w:val="left"/>
+            </w:pPr>
+            <w:r>
+              <w:rPr>
+                <w:rFonts w:ascii="Calibri" w:hAnsi="Calibri"/>
+                <w:color w:val="212121"/>
+                <w:sz w:val="19"/>
+              </w:rPr>
+              <w:t>Disease Analyst</w:t>
+            </w:r>
+          </w:p>
+        </w:tc>
+        <w:tc>
+          <w:tcPr>
+            <w:tcW w:type="dxa" w:w="3600"/>
+            <w:shd w:fill="FFFFFF"/>
+            <w:tcMar>
+              <w:top w:w="120" w:type="dxa"/>
+              <w:bottom w:w="120" w:type="dxa"/>
+              <w:left w:w="120" w:type="dxa"/>
+              <w:right w:w="120" w:type="dxa"/>
+            </w:tcMar>
+          </w:tcPr>
+          <w:p>
+            <w:pPr>
+              <w:spacing w:before="40" w:after="40" w:line="264" w:lineRule="auto"/>
+              <w:jc w:val="left"/>
+            </w:pPr>
+            <w:r>
+              <w:rPr>
+                <w:rFonts w:ascii="Calibri" w:hAnsi="Calibri"/>
+                <w:color w:val="212121"/>
+                <w:sz w:val="19"/>
+              </w:rPr>
+              <w:t xml:space="preserve">Queries </w:t>
+            </w:r>
+            <w:r>
+              <w:rPr>
+                <w:rFonts w:ascii="Calibri" w:hAnsi="Calibri"/>
+                <w:b/>
+                <w:color w:val="212121"/>
+                <w:sz w:val="19"/>
+              </w:rPr>
+              <w:t>Google Gemini Vision API</w:t>
+            </w:r>
+            <w:r>
+              <w:rPr>
+                <w:rFonts w:ascii="Calibri" w:hAnsi="Calibri"/>
+                <w:color w:val="212121"/>
+                <w:sz w:val="19"/>
+              </w:rPr>
+              <w:t xml:space="preserve"> to classify pathogen species, confidence rating, and suggested therapies.</w:t>
+            </w:r>
+          </w:p>
+        </w:tc>
+        <w:tc>
+          <w:tcPr>
+            <w:tcW w:type="dxa" w:w="2880"/>
+            <w:shd w:fill="FFFFFF"/>
+            <w:tcMar>
+              <w:top w:w="120" w:type="dxa"/>
+              <w:bottom w:w="120" w:type="dxa"/>
+              <w:left w:w="120" w:type="dxa"/>
+              <w:right w:w="120" w:type="dxa"/>
+            </w:tcMar>
+          </w:tcPr>
+          <w:p>
+            <w:pPr>
+              <w:spacing w:before="40" w:after="40" w:line="264" w:lineRule="auto"/>
+              <w:jc w:val="left"/>
+            </w:pPr>
+            <w:r>
+              <w:rPr>
+                <w:rFonts w:ascii="Calibri" w:hAnsi="Calibri"/>
+                <w:color w:val="212121"/>
+                <w:sz w:val="19"/>
+              </w:rPr>
+              <w:t>Input: Image file</w:t>
+              <w:br/>
+              <w:t>Output: Pathogen ID, confidence, therapies</w:t>
+            </w:r>
+          </w:p>
+        </w:tc>
+      </w:tr>
+      <w:tr>
+        <w:trPr>
+          <w:cantSplit/>
+        </w:trPr>
+        <w:tc>
+          <w:tcPr>
+            <w:tcW w:type="dxa" w:w="864"/>
+            <w:shd w:fill="F8FAF8"/>
+            <w:tcMar>
+              <w:top w:w="120" w:type="dxa"/>
+              <w:bottom w:w="120" w:type="dxa"/>
+              <w:left w:w="120" w:type="dxa"/>
+              <w:right w:w="120" w:type="dxa"/>
+            </w:tcMar>
+          </w:tcPr>
+          <w:p>
+            <w:pPr>
+              <w:spacing w:before="40" w:after="40" w:line="264" w:lineRule="auto"/>
+              <w:jc w:val="left"/>
+            </w:pPr>
+            <w:r>
+              <w:rPr>
+                <w:rFonts w:ascii="Calibri" w:hAnsi="Calibri"/>
+                <w:color w:val="212121"/>
+                <w:sz w:val="19"/>
+              </w:rPr>
+              <w:t>3</w:t>
+            </w:r>
+          </w:p>
+        </w:tc>
+        <w:tc>
+          <w:tcPr>
+            <w:tcW w:type="dxa" w:w="2016"/>
+            <w:shd w:fill="F8FAF8"/>
+            <w:tcMar>
+              <w:top w:w="120" w:type="dxa"/>
+              <w:bottom w:w="120" w:type="dxa"/>
+              <w:left w:w="120" w:type="dxa"/>
+              <w:right w:w="120" w:type="dxa"/>
+            </w:tcMar>
+          </w:tcPr>
+          <w:p>
+            <w:pPr>
+              <w:spacing w:before="40" w:after="40" w:line="264" w:lineRule="auto"/>
+              <w:jc w:val="left"/>
+            </w:pPr>
+            <w:r>
+              <w:rPr>
+                <w:rFonts w:ascii="Calibri" w:hAnsi="Calibri"/>
+                <w:color w:val="212121"/>
+                <w:sz w:val="19"/>
+              </w:rPr>
+              <w:t>Risk Evaluator</w:t>
+            </w:r>
+          </w:p>
+        </w:tc>
+        <w:tc>
+          <w:tcPr>
+            <w:tcW w:type="dxa" w:w="3600"/>
+            <w:shd w:fill="F8FAF8"/>
+            <w:tcMar>
+              <w:top w:w="120" w:type="dxa"/>
+              <w:bottom w:w="120" w:type="dxa"/>
+              <w:left w:w="120" w:type="dxa"/>
+              <w:right w:w="120" w:type="dxa"/>
+            </w:tcMar>
+          </w:tcPr>
+          <w:p>
+            <w:pPr>
+              <w:spacing w:before="40" w:after="40" w:line="264" w:lineRule="auto"/>
+              <w:jc w:val="left"/>
+            </w:pPr>
+            <w:r>
+              <w:rPr>
+                <w:rFonts w:ascii="Calibri" w:hAnsi="Calibri"/>
+                <w:color w:val="212121"/>
+                <w:sz w:val="19"/>
+              </w:rPr>
+              <w:t>Evaluates meteorological conditions (wind speed, rain) to assess disease spread dynamics.</w:t>
+            </w:r>
+          </w:p>
+        </w:tc>
+        <w:tc>
+          <w:tcPr>
+            <w:tcW w:type="dxa" w:w="2880"/>
+            <w:shd w:fill="F8FAF8"/>
+            <w:tcMar>
+              <w:top w:w="120" w:type="dxa"/>
+              <w:bottom w:w="120" w:type="dxa"/>
+              <w:left w:w="120" w:type="dxa"/>
+              <w:right w:w="120" w:type="dxa"/>
+            </w:tcMar>
+          </w:tcPr>
+          <w:p>
+            <w:pPr>
+              <w:spacing w:before="40" w:after="40" w:line="264" w:lineRule="auto"/>
+              <w:jc w:val="left"/>
+            </w:pPr>
+            <w:r>
+              <w:rPr>
+                <w:rFonts w:ascii="Calibri" w:hAnsi="Calibri"/>
+                <w:color w:val="212121"/>
+                <w:sz w:val="19"/>
+              </w:rPr>
+              <w:t>Input: Local weather indices</w:t>
+              <w:br/>
+              <w:t>Output: Contagion percentage</w:t>
+            </w:r>
+          </w:p>
+        </w:tc>
+      </w:tr>
+      <w:tr>
+        <w:trPr>
+          <w:cantSplit/>
+        </w:trPr>
+        <w:tc>
+          <w:tcPr>
+            <w:tcW w:type="dxa" w:w="864"/>
+            <w:shd w:fill="FFFFFF"/>
+            <w:tcMar>
+              <w:top w:w="120" w:type="dxa"/>
+              <w:bottom w:w="120" w:type="dxa"/>
+              <w:left w:w="120" w:type="dxa"/>
+              <w:right w:w="120" w:type="dxa"/>
+            </w:tcMar>
+          </w:tcPr>
+          <w:p>
+            <w:pPr>
+              <w:spacing w:before="40" w:after="40" w:line="264" w:lineRule="auto"/>
+              <w:jc w:val="left"/>
+            </w:pPr>
+            <w:r>
+              <w:rPr>
+                <w:rFonts w:ascii="Calibri" w:hAnsi="Calibri"/>
+                <w:color w:val="212121"/>
+                <w:sz w:val="19"/>
+              </w:rPr>
+              <w:t>4</w:t>
+            </w:r>
+          </w:p>
+        </w:tc>
+        <w:tc>
+          <w:tcPr>
+            <w:tcW w:type="dxa" w:w="2016"/>
+            <w:shd w:fill="FFFFFF"/>
+            <w:tcMar>
+              <w:top w:w="120" w:type="dxa"/>
+              <w:bottom w:w="120" w:type="dxa"/>
+              <w:left w:w="120" w:type="dxa"/>
+              <w:right w:w="120" w:type="dxa"/>
+            </w:tcMar>
+          </w:tcPr>
+          <w:p>
+            <w:pPr>
+              <w:spacing w:before="40" w:after="40" w:line="264" w:lineRule="auto"/>
+              <w:jc w:val="left"/>
+            </w:pPr>
+            <w:r>
+              <w:rPr>
+                <w:rFonts w:ascii="Calibri" w:hAnsi="Calibri"/>
+                <w:color w:val="212121"/>
+                <w:sz w:val="19"/>
+              </w:rPr>
+              <w:t>Constraint Planner</w:t>
+            </w:r>
+          </w:p>
+        </w:tc>
+        <w:tc>
+          <w:tcPr>
+            <w:tcW w:type="dxa" w:w="3600"/>
+            <w:shd w:fill="FFFFFF"/>
+            <w:tcMar>
+              <w:top w:w="120" w:type="dxa"/>
+              <w:bottom w:w="120" w:type="dxa"/>
+              <w:left w:w="120" w:type="dxa"/>
+              <w:right w:w="120" w:type="dxa"/>
+            </w:tcMar>
+          </w:tcPr>
+          <w:p>
+            <w:pPr>
+              <w:spacing w:before="40" w:after="40" w:line="264" w:lineRule="auto"/>
+              <w:jc w:val="left"/>
+            </w:pPr>
+            <w:r>
+              <w:rPr>
+                <w:rFonts w:ascii="Calibri" w:hAnsi="Calibri"/>
+                <w:color w:val="212121"/>
+                <w:sz w:val="19"/>
+              </w:rPr>
+            </w:r>
+            <w:r>
+              <w:rPr>
+                <w:rFonts w:ascii="Calibri" w:hAnsi="Calibri"/>
+                <w:b/>
+                <w:color w:val="212121"/>
+                <w:sz w:val="19"/>
+              </w:rPr>
+              <w:t>Constraint Rules Audit:</w:t>
+            </w:r>
+            <w:r>
+              <w:rPr>
+                <w:rFonts w:ascii="Calibri" w:hAnsi="Calibri"/>
+                <w:color w:val="212121"/>
+                <w:sz w:val="19"/>
+              </w:rPr>
+              <w:t xml:space="preserve"> Audits suggestions against safety rules (e.g., overrides spray commands if high wind is reported).</w:t>
+            </w:r>
+          </w:p>
+        </w:tc>
+        <w:tc>
+          <w:tcPr>
+            <w:tcW w:type="dxa" w:w="2880"/>
+            <w:shd w:fill="FFFFFF"/>
+            <w:tcMar>
+              <w:top w:w="120" w:type="dxa"/>
+              <w:bottom w:w="120" w:type="dxa"/>
+              <w:left w:w="120" w:type="dxa"/>
+              <w:right w:w="120" w:type="dxa"/>
+            </w:tcMar>
+          </w:tcPr>
+          <w:p>
+            <w:pPr>
+              <w:spacing w:before="40" w:after="40" w:line="264" w:lineRule="auto"/>
+              <w:jc w:val="left"/>
+            </w:pPr>
+            <w:r>
+              <w:rPr>
+                <w:rFonts w:ascii="Calibri" w:hAnsi="Calibri"/>
+                <w:color w:val="212121"/>
+                <w:sz w:val="19"/>
+              </w:rPr>
+              <w:t>Input: Suggested treatment, weather</w:t>
+              <w:br/>
+              <w:t>Output: Overridden, safe treatment plan</w:t>
+            </w:r>
+          </w:p>
+        </w:tc>
+      </w:tr>
+      <w:tr>
+        <w:trPr>
+          <w:cantSplit/>
+        </w:trPr>
+        <w:tc>
+          <w:tcPr>
+            <w:tcW w:type="dxa" w:w="864"/>
+            <w:shd w:fill="F8FAF8"/>
+            <w:tcMar>
+              <w:top w:w="120" w:type="dxa"/>
+              <w:bottom w:w="120" w:type="dxa"/>
+              <w:left w:w="120" w:type="dxa"/>
+              <w:right w:w="120" w:type="dxa"/>
+            </w:tcMar>
+          </w:tcPr>
+          <w:p>
+            <w:pPr>
+              <w:spacing w:before="40" w:after="40" w:line="264" w:lineRule="auto"/>
+              <w:jc w:val="left"/>
+            </w:pPr>
+            <w:r>
+              <w:rPr>
+                <w:rFonts w:ascii="Calibri" w:hAnsi="Calibri"/>
+                <w:color w:val="212121"/>
+                <w:sz w:val="19"/>
+              </w:rPr>
+              <w:t>5</w:t>
+            </w:r>
+          </w:p>
+        </w:tc>
+        <w:tc>
+          <w:tcPr>
+            <w:tcW w:type="dxa" w:w="2016"/>
+            <w:shd w:fill="F8FAF8"/>
+            <w:tcMar>
+              <w:top w:w="120" w:type="dxa"/>
+              <w:bottom w:w="120" w:type="dxa"/>
+              <w:left w:w="120" w:type="dxa"/>
+              <w:right w:w="120" w:type="dxa"/>
+            </w:tcMar>
+          </w:tcPr>
+          <w:p>
+            <w:pPr>
+              <w:spacing w:before="40" w:after="40" w:line="264" w:lineRule="auto"/>
+              <w:jc w:val="left"/>
+            </w:pPr>
+            <w:r>
+              <w:rPr>
+                <w:rFonts w:ascii="Calibri" w:hAnsi="Calibri"/>
+                <w:color w:val="212121"/>
+                <w:sz w:val="19"/>
+              </w:rPr>
+              <w:t>Action Executor</w:t>
+            </w:r>
+          </w:p>
+        </w:tc>
+        <w:tc>
+          <w:tcPr>
+            <w:tcW w:type="dxa" w:w="3600"/>
+            <w:shd w:fill="F8FAF8"/>
+            <w:tcMar>
+              <w:top w:w="120" w:type="dxa"/>
+              <w:bottom w:w="120" w:type="dxa"/>
+              <w:left w:w="120" w:type="dxa"/>
+              <w:right w:w="120" w:type="dxa"/>
+            </w:tcMar>
+          </w:tcPr>
+          <w:p>
+            <w:pPr>
+              <w:spacing w:before="40" w:after="40" w:line="264" w:lineRule="auto"/>
+              <w:jc w:val="left"/>
+            </w:pPr>
+            <w:r>
+              <w:rPr>
+                <w:rFonts w:ascii="Calibri" w:hAnsi="Calibri"/>
+                <w:color w:val="212121"/>
+                <w:sz w:val="19"/>
+              </w:rPr>
+              <w:t>Constructs transactional payloads and issues dispatch signals to IoT smart valves or drone hubs.</w:t>
+            </w:r>
+          </w:p>
+        </w:tc>
+        <w:tc>
+          <w:tcPr>
+            <w:tcW w:type="dxa" w:w="2880"/>
+            <w:shd w:fill="F8FAF8"/>
+            <w:tcMar>
+              <w:top w:w="120" w:type="dxa"/>
+              <w:bottom w:w="120" w:type="dxa"/>
+              <w:left w:w="120" w:type="dxa"/>
+              <w:right w:w="120" w:type="dxa"/>
+            </w:tcMar>
+          </w:tcPr>
+          <w:p>
+            <w:pPr>
+              <w:spacing w:before="40" w:after="40" w:line="264" w:lineRule="auto"/>
+              <w:jc w:val="left"/>
+            </w:pPr>
+            <w:r>
+              <w:rPr>
+                <w:rFonts w:ascii="Calibri" w:hAnsi="Calibri"/>
+                <w:color w:val="212121"/>
+                <w:sz w:val="19"/>
+              </w:rPr>
+              <w:t>Input: Approved treatments</w:t>
+              <w:br/>
+              <w:t>Output: Actuator codes &amp; target statuses</w:t>
+            </w:r>
+          </w:p>
+        </w:tc>
+      </w:tr>
+      <w:tr>
+        <w:trPr>
+          <w:cantSplit/>
+        </w:trPr>
+        <w:tc>
+          <w:tcPr>
+            <w:tcW w:type="dxa" w:w="864"/>
+            <w:shd w:fill="FFFFFF"/>
+            <w:tcMar>
+              <w:top w:w="120" w:type="dxa"/>
+              <w:bottom w:w="120" w:type="dxa"/>
+              <w:left w:w="120" w:type="dxa"/>
+              <w:right w:w="120" w:type="dxa"/>
+            </w:tcMar>
+          </w:tcPr>
+          <w:p>
+            <w:pPr>
+              <w:spacing w:before="40" w:after="40" w:line="264" w:lineRule="auto"/>
+              <w:jc w:val="left"/>
+            </w:pPr>
+            <w:r>
+              <w:rPr>
+                <w:rFonts w:ascii="Calibri" w:hAnsi="Calibri"/>
+                <w:color w:val="212121"/>
+                <w:sz w:val="19"/>
+              </w:rPr>
+              <w:t>6</w:t>
+            </w:r>
+          </w:p>
+        </w:tc>
+        <w:tc>
+          <w:tcPr>
+            <w:tcW w:type="dxa" w:w="2016"/>
+            <w:shd w:fill="FFFFFF"/>
+            <w:tcMar>
+              <w:top w:w="120" w:type="dxa"/>
+              <w:bottom w:w="120" w:type="dxa"/>
+              <w:left w:w="120" w:type="dxa"/>
+              <w:right w:w="120" w:type="dxa"/>
+            </w:tcMar>
+          </w:tcPr>
+          <w:p>
+            <w:pPr>
+              <w:spacing w:before="40" w:after="40" w:line="264" w:lineRule="auto"/>
+              <w:jc w:val="left"/>
+            </w:pPr>
+            <w:r>
+              <w:rPr>
+                <w:rFonts w:ascii="Calibri" w:hAnsi="Calibri"/>
+                <w:color w:val="212121"/>
+                <w:sz w:val="19"/>
+              </w:rPr>
+              <w:t>Recovery Monitor</w:t>
+            </w:r>
+          </w:p>
+        </w:tc>
+        <w:tc>
+          <w:tcPr>
+            <w:tcW w:type="dxa" w:w="3600"/>
+            <w:shd w:fill="FFFFFF"/>
+            <w:tcMar>
+              <w:top w:w="120" w:type="dxa"/>
+              <w:bottom w:w="120" w:type="dxa"/>
+              <w:left w:w="120" w:type="dxa"/>
+              <w:right w:w="120" w:type="dxa"/>
+            </w:tcMar>
+          </w:tcPr>
+          <w:p>
+            <w:pPr>
+              <w:spacing w:before="40" w:after="40" w:line="264" w:lineRule="auto"/>
+              <w:jc w:val="left"/>
+            </w:pPr>
+            <w:r>
+              <w:rPr>
+                <w:rFonts w:ascii="Calibri" w:hAnsi="Calibri"/>
+                <w:color w:val="212121"/>
+                <w:sz w:val="19"/>
+              </w:rPr>
+              <w:t>Listens for hardware feedback. If faults occur, manages retries, engages fallback suppliers, or initiates a state rollback.</w:t>
+            </w:r>
+          </w:p>
+        </w:tc>
+        <w:tc>
+          <w:tcPr>
+            <w:tcW w:type="dxa" w:w="2880"/>
+            <w:shd w:fill="FFFFFF"/>
+            <w:tcMar>
+              <w:top w:w="120" w:type="dxa"/>
+              <w:bottom w:w="120" w:type="dxa"/>
+              <w:left w:w="120" w:type="dxa"/>
+              <w:right w:w="120" w:type="dxa"/>
+            </w:tcMar>
+          </w:tcPr>
+          <w:p>
+            <w:pPr>
+              <w:spacing w:before="40" w:after="40" w:line="264" w:lineRule="auto"/>
+              <w:jc w:val="left"/>
+            </w:pPr>
+            <w:r>
+              <w:rPr>
+                <w:rFonts w:ascii="Calibri" w:hAnsi="Calibri"/>
+                <w:color w:val="212121"/>
+                <w:sz w:val="19"/>
+              </w:rPr>
+              <w:t>Input: Hardware telemetry, latency</w:t>
+              <w:br/>
+              <w:t>Output: Safe hardware state lock &amp; alerts</w:t>
+            </w:r>
+          </w:p>
+        </w:tc>
+      </w:tr>
+    </w:tbl>
+    <w:p>
+      <w:pPr>
+        <w:spacing w:before="0" w:after="240"/>
+      </w:pPr>
+    </w:p>
+    <w:p>
+      <w:pPr>
+        <w:pStyle w:val="Heading1"/>
+        <w:keepNext/>
+        <w:spacing w:before="440" w:after="200"/>
+      </w:pPr>
       <w:r>
         <w:rPr>
+          <w:rFonts w:ascii="Calibri Light" w:hAnsi="Calibri Light"/>
           <w:b/>
+          <w:color w:val="1B5E20"/>
+          <w:sz w:val="40"/>
         </w:rPr>
-        <w:t>Purpose:</w:t>
-      </w:r>
-      <w:r>
-        <w:t xml:space="preserve"> Served as the high-fidelity management console and resiliency cockpit for farm operators.</w:t>
+        <w:t>4. API Endpoint Specifications</w:t>
       </w:r>
     </w:p>
     <w:p>
       <w:pPr>
-        <w:pStyle w:val="ListBullet"/>
-        <w:spacing w:after="60"/>
+        <w:spacing w:before="0" w:after="120" w:line="276" w:lineRule="auto"/>
       </w:pPr>
-      <w:r/>
+      <w:r>
+        <w:t>The Node.js Express server exposes a secure, token-protected RESTful API. All critical endpoints are protected with standard JWT Bearer headers and incorporate validation checks:</w:t>
+      </w:r>
+    </w:p>
+    <w:tbl>
+      <w:tblPr>
+        <w:tblW w:type="auto" w:w="0"/>
+        <w:jc w:val="center"/>
+        <w:tblLayout w:type="fixed"/>
+        <w:tblLook w:firstColumn="1" w:firstRow="1" w:lastColumn="0" w:lastRow="0" w:noHBand="0" w:noVBand="1" w:val="04A0"/>
+        <w:tblBorders>
+          <w:top w:val="single" w:sz="4" w:space="0" w:color="D1D8D1"/>
+          <w:left w:val="single" w:sz="4" w:space="0" w:color="D1D8D1"/>
+          <w:bottom w:val="single" w:sz="4" w:space="0" w:color="D1D8D1"/>
+          <w:right w:val="single" w:sz="4" w:space="0" w:color="D1D8D1"/>
+          <w:insideH w:val="single" w:sz="4" w:space="0" w:color="D1D8D1"/>
+          <w:insideV w:val="single" w:sz="4" w:space="0" w:color="D1D8D1"/>
+        </w:tblBorders>
+      </w:tblPr>
+      <w:tblGrid>
+        <w:gridCol w:w="1152"/>
+        <w:gridCol w:w="2304"/>
+        <w:gridCol w:w="2016"/>
+        <w:gridCol w:w="1152"/>
+        <w:gridCol w:w="2736"/>
+      </w:tblGrid>
+      <w:tr>
+        <w:trPr>
+          <w:tblHeader/>
+          <w:cantSplit/>
+        </w:trPr>
+        <w:tc>
+          <w:tcPr>
+            <w:tcW w:type="dxa" w:w="1152"/>
+            <w:shd w:fill="1B5E20"/>
+            <w:tcMar>
+              <w:top w:w="160" w:type="dxa"/>
+              <w:bottom w:w="160" w:type="dxa"/>
+              <w:left w:w="120" w:type="dxa"/>
+              <w:right w:w="120" w:type="dxa"/>
+            </w:tcMar>
+          </w:tcPr>
+          <w:p>
+            <w:pPr>
+              <w:spacing w:before="40" w:after="40"/>
+              <w:jc w:val="left"/>
+            </w:pPr>
+            <w:r>
+              <w:rPr>
+                <w:rFonts w:ascii="Calibri" w:hAnsi="Calibri"/>
+                <w:b/>
+                <w:color w:val="FFFFFF"/>
+                <w:sz w:val="20"/>
+              </w:rPr>
+              <w:t>Method</w:t>
+            </w:r>
+          </w:p>
+        </w:tc>
+        <w:tc>
+          <w:tcPr>
+            <w:tcW w:type="dxa" w:w="2304"/>
+            <w:shd w:fill="1B5E20"/>
+            <w:tcMar>
+              <w:top w:w="160" w:type="dxa"/>
+              <w:bottom w:w="160" w:type="dxa"/>
+              <w:left w:w="120" w:type="dxa"/>
+              <w:right w:w="120" w:type="dxa"/>
+            </w:tcMar>
+          </w:tcPr>
+          <w:p>
+            <w:pPr>
+              <w:spacing w:before="40" w:after="40"/>
+              <w:jc w:val="left"/>
+            </w:pPr>
+            <w:r>
+              <w:rPr>
+                <w:rFonts w:ascii="Calibri" w:hAnsi="Calibri"/>
+                <w:b/>
+                <w:color w:val="FFFFFF"/>
+                <w:sz w:val="20"/>
+              </w:rPr>
+              <w:t>Endpoint Path</w:t>
+            </w:r>
+          </w:p>
+        </w:tc>
+        <w:tc>
+          <w:tcPr>
+            <w:tcW w:type="dxa" w:w="2016"/>
+            <w:shd w:fill="1B5E20"/>
+            <w:tcMar>
+              <w:top w:w="160" w:type="dxa"/>
+              <w:bottom w:w="160" w:type="dxa"/>
+              <w:left w:w="120" w:type="dxa"/>
+              <w:right w:w="120" w:type="dxa"/>
+            </w:tcMar>
+          </w:tcPr>
+          <w:p>
+            <w:pPr>
+              <w:spacing w:before="40" w:after="40"/>
+              <w:jc w:val="left"/>
+            </w:pPr>
+            <w:r>
+              <w:rPr>
+                <w:rFonts w:ascii="Calibri" w:hAnsi="Calibri"/>
+                <w:b/>
+                <w:color w:val="FFFFFF"/>
+                <w:sz w:val="20"/>
+              </w:rPr>
+              <w:t>Controller Reference</w:t>
+            </w:r>
+          </w:p>
+        </w:tc>
+        <w:tc>
+          <w:tcPr>
+            <w:tcW w:type="dxa" w:w="1152"/>
+            <w:shd w:fill="1B5E20"/>
+            <w:tcMar>
+              <w:top w:w="160" w:type="dxa"/>
+              <w:bottom w:w="160" w:type="dxa"/>
+              <w:left w:w="120" w:type="dxa"/>
+              <w:right w:w="120" w:type="dxa"/>
+            </w:tcMar>
+          </w:tcPr>
+          <w:p>
+            <w:pPr>
+              <w:spacing w:before="40" w:after="40"/>
+              <w:jc w:val="left"/>
+            </w:pPr>
+            <w:r>
+              <w:rPr>
+                <w:rFonts w:ascii="Calibri" w:hAnsi="Calibri"/>
+                <w:b/>
+                <w:color w:val="FFFFFF"/>
+                <w:sz w:val="20"/>
+              </w:rPr>
+              <w:t>Auth</w:t>
+            </w:r>
+          </w:p>
+        </w:tc>
+        <w:tc>
+          <w:tcPr>
+            <w:tcW w:type="dxa" w:w="2736"/>
+            <w:shd w:fill="1B5E20"/>
+            <w:tcMar>
+              <w:top w:w="160" w:type="dxa"/>
+              <w:bottom w:w="160" w:type="dxa"/>
+              <w:left w:w="120" w:type="dxa"/>
+              <w:right w:w="120" w:type="dxa"/>
+            </w:tcMar>
+          </w:tcPr>
+          <w:p>
+            <w:pPr>
+              <w:spacing w:before="40" w:after="40"/>
+              <w:jc w:val="left"/>
+            </w:pPr>
+            <w:r>
+              <w:rPr>
+                <w:rFonts w:ascii="Calibri" w:hAnsi="Calibri"/>
+                <w:b/>
+                <w:color w:val="FFFFFF"/>
+                <w:sz w:val="20"/>
+              </w:rPr>
+              <w:t>Resiliency Strategy</w:t>
+            </w:r>
+          </w:p>
+        </w:tc>
+      </w:tr>
+      <w:tr>
+        <w:trPr>
+          <w:cantSplit/>
+        </w:trPr>
+        <w:tc>
+          <w:tcPr>
+            <w:tcW w:type="dxa" w:w="1152"/>
+            <w:shd w:fill="F8FAF8"/>
+            <w:tcMar>
+              <w:top w:w="120" w:type="dxa"/>
+              <w:bottom w:w="120" w:type="dxa"/>
+              <w:left w:w="120" w:type="dxa"/>
+              <w:right w:w="120" w:type="dxa"/>
+            </w:tcMar>
+          </w:tcPr>
+          <w:p>
+            <w:pPr>
+              <w:spacing w:before="40" w:after="40" w:line="264" w:lineRule="auto"/>
+              <w:jc w:val="left"/>
+            </w:pPr>
+            <w:r>
+              <w:rPr>
+                <w:rFonts w:ascii="Calibri" w:hAnsi="Calibri"/>
+                <w:color w:val="212121"/>
+                <w:sz w:val="19"/>
+              </w:rPr>
+              <w:t>POST</w:t>
+            </w:r>
+          </w:p>
+        </w:tc>
+        <w:tc>
+          <w:tcPr>
+            <w:tcW w:type="dxa" w:w="2304"/>
+            <w:shd w:fill="F8FAF8"/>
+            <w:tcMar>
+              <w:top w:w="120" w:type="dxa"/>
+              <w:bottom w:w="120" w:type="dxa"/>
+              <w:left w:w="120" w:type="dxa"/>
+              <w:right w:w="120" w:type="dxa"/>
+            </w:tcMar>
+          </w:tcPr>
+          <w:p>
+            <w:pPr>
+              <w:spacing w:before="40" w:after="40" w:line="264" w:lineRule="auto"/>
+              <w:jc w:val="left"/>
+            </w:pPr>
+            <w:r>
+              <w:rPr>
+                <w:rFonts w:ascii="Calibri" w:hAnsi="Calibri"/>
+                <w:color w:val="212121"/>
+                <w:sz w:val="19"/>
+              </w:rPr>
+              <w:t>/api/auth/register</w:t>
+            </w:r>
+          </w:p>
+        </w:tc>
+        <w:tc>
+          <w:tcPr>
+            <w:tcW w:type="dxa" w:w="2016"/>
+            <w:shd w:fill="F8FAF8"/>
+            <w:tcMar>
+              <w:top w:w="120" w:type="dxa"/>
+              <w:bottom w:w="120" w:type="dxa"/>
+              <w:left w:w="120" w:type="dxa"/>
+              <w:right w:w="120" w:type="dxa"/>
+            </w:tcMar>
+          </w:tcPr>
+          <w:p>
+            <w:pPr>
+              <w:spacing w:before="40" w:after="40" w:line="264" w:lineRule="auto"/>
+              <w:jc w:val="left"/>
+            </w:pPr>
+            <w:r>
+              <w:rPr>
+                <w:rFonts w:ascii="Calibri" w:hAnsi="Calibri"/>
+                <w:color w:val="212121"/>
+                <w:sz w:val="19"/>
+              </w:rPr>
+              <w:t>auth_controller.js</w:t>
+            </w:r>
+          </w:p>
+        </w:tc>
+        <w:tc>
+          <w:tcPr>
+            <w:tcW w:type="dxa" w:w="1152"/>
+            <w:shd w:fill="F8FAF8"/>
+            <w:tcMar>
+              <w:top w:w="120" w:type="dxa"/>
+              <w:bottom w:w="120" w:type="dxa"/>
+              <w:left w:w="120" w:type="dxa"/>
+              <w:right w:w="120" w:type="dxa"/>
+            </w:tcMar>
+          </w:tcPr>
+          <w:p>
+            <w:pPr>
+              <w:spacing w:before="40" w:after="40" w:line="264" w:lineRule="auto"/>
+              <w:jc w:val="left"/>
+            </w:pPr>
+            <w:r>
+              <w:rPr>
+                <w:rFonts w:ascii="Calibri" w:hAnsi="Calibri"/>
+                <w:color w:val="212121"/>
+                <w:sz w:val="19"/>
+              </w:rPr>
+              <w:t>None</w:t>
+            </w:r>
+          </w:p>
+        </w:tc>
+        <w:tc>
+          <w:tcPr>
+            <w:tcW w:type="dxa" w:w="2736"/>
+            <w:shd w:fill="F8FAF8"/>
+            <w:tcMar>
+              <w:top w:w="120" w:type="dxa"/>
+              <w:bottom w:w="120" w:type="dxa"/>
+              <w:left w:w="120" w:type="dxa"/>
+              <w:right w:w="120" w:type="dxa"/>
+            </w:tcMar>
+          </w:tcPr>
+          <w:p>
+            <w:pPr>
+              <w:spacing w:before="40" w:after="40" w:line="264" w:lineRule="auto"/>
+              <w:jc w:val="left"/>
+            </w:pPr>
+            <w:r>
+              <w:rPr>
+                <w:rFonts w:ascii="Calibri" w:hAnsi="Calibri"/>
+                <w:color w:val="212121"/>
+                <w:sz w:val="19"/>
+              </w:rPr>
+              <w:t>Creates account, generates MFA token</w:t>
+            </w:r>
+          </w:p>
+        </w:tc>
+      </w:tr>
+      <w:tr>
+        <w:trPr>
+          <w:cantSplit/>
+        </w:trPr>
+        <w:tc>
+          <w:tcPr>
+            <w:tcW w:type="dxa" w:w="1152"/>
+            <w:shd w:fill="FFFFFF"/>
+            <w:tcMar>
+              <w:top w:w="120" w:type="dxa"/>
+              <w:bottom w:w="120" w:type="dxa"/>
+              <w:left w:w="120" w:type="dxa"/>
+              <w:right w:w="120" w:type="dxa"/>
+            </w:tcMar>
+          </w:tcPr>
+          <w:p>
+            <w:pPr>
+              <w:spacing w:before="40" w:after="40" w:line="264" w:lineRule="auto"/>
+              <w:jc w:val="left"/>
+            </w:pPr>
+            <w:r>
+              <w:rPr>
+                <w:rFonts w:ascii="Calibri" w:hAnsi="Calibri"/>
+                <w:color w:val="212121"/>
+                <w:sz w:val="19"/>
+              </w:rPr>
+              <w:t>POST</w:t>
+            </w:r>
+          </w:p>
+        </w:tc>
+        <w:tc>
+          <w:tcPr>
+            <w:tcW w:type="dxa" w:w="2304"/>
+            <w:shd w:fill="FFFFFF"/>
+            <w:tcMar>
+              <w:top w:w="120" w:type="dxa"/>
+              <w:bottom w:w="120" w:type="dxa"/>
+              <w:left w:w="120" w:type="dxa"/>
+              <w:right w:w="120" w:type="dxa"/>
+            </w:tcMar>
+          </w:tcPr>
+          <w:p>
+            <w:pPr>
+              <w:spacing w:before="40" w:after="40" w:line="264" w:lineRule="auto"/>
+              <w:jc w:val="left"/>
+            </w:pPr>
+            <w:r>
+              <w:rPr>
+                <w:rFonts w:ascii="Calibri" w:hAnsi="Calibri"/>
+                <w:color w:val="212121"/>
+                <w:sz w:val="19"/>
+              </w:rPr>
+              <w:t>/api/auth/login</w:t>
+            </w:r>
+          </w:p>
+        </w:tc>
+        <w:tc>
+          <w:tcPr>
+            <w:tcW w:type="dxa" w:w="2016"/>
+            <w:shd w:fill="FFFFFF"/>
+            <w:tcMar>
+              <w:top w:w="120" w:type="dxa"/>
+              <w:bottom w:w="120" w:type="dxa"/>
+              <w:left w:w="120" w:type="dxa"/>
+              <w:right w:w="120" w:type="dxa"/>
+            </w:tcMar>
+          </w:tcPr>
+          <w:p>
+            <w:pPr>
+              <w:spacing w:before="40" w:after="40" w:line="264" w:lineRule="auto"/>
+              <w:jc w:val="left"/>
+            </w:pPr>
+            <w:r>
+              <w:rPr>
+                <w:rFonts w:ascii="Calibri" w:hAnsi="Calibri"/>
+                <w:color w:val="212121"/>
+                <w:sz w:val="19"/>
+              </w:rPr>
+              <w:t>auth_controller.js</w:t>
+            </w:r>
+          </w:p>
+        </w:tc>
+        <w:tc>
+          <w:tcPr>
+            <w:tcW w:type="dxa" w:w="1152"/>
+            <w:shd w:fill="FFFFFF"/>
+            <w:tcMar>
+              <w:top w:w="120" w:type="dxa"/>
+              <w:bottom w:w="120" w:type="dxa"/>
+              <w:left w:w="120" w:type="dxa"/>
+              <w:right w:w="120" w:type="dxa"/>
+            </w:tcMar>
+          </w:tcPr>
+          <w:p>
+            <w:pPr>
+              <w:spacing w:before="40" w:after="40" w:line="264" w:lineRule="auto"/>
+              <w:jc w:val="left"/>
+            </w:pPr>
+            <w:r>
+              <w:rPr>
+                <w:rFonts w:ascii="Calibri" w:hAnsi="Calibri"/>
+                <w:color w:val="212121"/>
+                <w:sz w:val="19"/>
+              </w:rPr>
+              <w:t>None</w:t>
+            </w:r>
+          </w:p>
+        </w:tc>
+        <w:tc>
+          <w:tcPr>
+            <w:tcW w:type="dxa" w:w="2736"/>
+            <w:shd w:fill="FFFFFF"/>
+            <w:tcMar>
+              <w:top w:w="120" w:type="dxa"/>
+              <w:bottom w:w="120" w:type="dxa"/>
+              <w:left w:w="120" w:type="dxa"/>
+              <w:right w:w="120" w:type="dxa"/>
+            </w:tcMar>
+          </w:tcPr>
+          <w:p>
+            <w:pPr>
+              <w:spacing w:before="40" w:after="40" w:line="264" w:lineRule="auto"/>
+              <w:jc w:val="left"/>
+            </w:pPr>
+            <w:r>
+              <w:rPr>
+                <w:rFonts w:ascii="Calibri" w:hAnsi="Calibri"/>
+                <w:color w:val="212121"/>
+                <w:sz w:val="19"/>
+              </w:rPr>
+              <w:t>Returns JWT bearer token</w:t>
+            </w:r>
+          </w:p>
+        </w:tc>
+      </w:tr>
+      <w:tr>
+        <w:trPr>
+          <w:cantSplit/>
+        </w:trPr>
+        <w:tc>
+          <w:tcPr>
+            <w:tcW w:type="dxa" w:w="1152"/>
+            <w:shd w:fill="F8FAF8"/>
+            <w:tcMar>
+              <w:top w:w="120" w:type="dxa"/>
+              <w:bottom w:w="120" w:type="dxa"/>
+              <w:left w:w="120" w:type="dxa"/>
+              <w:right w:w="120" w:type="dxa"/>
+            </w:tcMar>
+          </w:tcPr>
+          <w:p>
+            <w:pPr>
+              <w:spacing w:before="40" w:after="40" w:line="264" w:lineRule="auto"/>
+              <w:jc w:val="left"/>
+            </w:pPr>
+            <w:r>
+              <w:rPr>
+                <w:rFonts w:ascii="Calibri" w:hAnsi="Calibri"/>
+                <w:color w:val="212121"/>
+                <w:sz w:val="19"/>
+              </w:rPr>
+              <w:t>POST</w:t>
+            </w:r>
+          </w:p>
+        </w:tc>
+        <w:tc>
+          <w:tcPr>
+            <w:tcW w:type="dxa" w:w="2304"/>
+            <w:shd w:fill="F8FAF8"/>
+            <w:tcMar>
+              <w:top w:w="120" w:type="dxa"/>
+              <w:bottom w:w="120" w:type="dxa"/>
+              <w:left w:w="120" w:type="dxa"/>
+              <w:right w:w="120" w:type="dxa"/>
+            </w:tcMar>
+          </w:tcPr>
+          <w:p>
+            <w:pPr>
+              <w:spacing w:before="40" w:after="40" w:line="264" w:lineRule="auto"/>
+              <w:jc w:val="left"/>
+            </w:pPr>
+            <w:r>
+              <w:rPr>
+                <w:rFonts w:ascii="Calibri" w:hAnsi="Calibri"/>
+                <w:color w:val="212121"/>
+                <w:sz w:val="19"/>
+              </w:rPr>
+              <w:t>/api/auth/send-otp</w:t>
+            </w:r>
+          </w:p>
+        </w:tc>
+        <w:tc>
+          <w:tcPr>
+            <w:tcW w:type="dxa" w:w="2016"/>
+            <w:shd w:fill="F8FAF8"/>
+            <w:tcMar>
+              <w:top w:w="120" w:type="dxa"/>
+              <w:bottom w:w="120" w:type="dxa"/>
+              <w:left w:w="120" w:type="dxa"/>
+              <w:right w:w="120" w:type="dxa"/>
+            </w:tcMar>
+          </w:tcPr>
+          <w:p>
+            <w:pPr>
+              <w:spacing w:before="40" w:after="40" w:line="264" w:lineRule="auto"/>
+              <w:jc w:val="left"/>
+            </w:pPr>
+            <w:r>
+              <w:rPr>
+                <w:rFonts w:ascii="Calibri" w:hAnsi="Calibri"/>
+                <w:color w:val="212121"/>
+                <w:sz w:val="19"/>
+              </w:rPr>
+              <w:t>auth_controller.js</w:t>
+            </w:r>
+          </w:p>
+        </w:tc>
+        <w:tc>
+          <w:tcPr>
+            <w:tcW w:type="dxa" w:w="1152"/>
+            <w:shd w:fill="F8FAF8"/>
+            <w:tcMar>
+              <w:top w:w="120" w:type="dxa"/>
+              <w:bottom w:w="120" w:type="dxa"/>
+              <w:left w:w="120" w:type="dxa"/>
+              <w:right w:w="120" w:type="dxa"/>
+            </w:tcMar>
+          </w:tcPr>
+          <w:p>
+            <w:pPr>
+              <w:spacing w:before="40" w:after="40" w:line="264" w:lineRule="auto"/>
+              <w:jc w:val="left"/>
+            </w:pPr>
+            <w:r>
+              <w:rPr>
+                <w:rFonts w:ascii="Calibri" w:hAnsi="Calibri"/>
+                <w:color w:val="212121"/>
+                <w:sz w:val="19"/>
+              </w:rPr>
+              <w:t>None</w:t>
+            </w:r>
+          </w:p>
+        </w:tc>
+        <w:tc>
+          <w:tcPr>
+            <w:tcW w:type="dxa" w:w="2736"/>
+            <w:shd w:fill="F8FAF8"/>
+            <w:tcMar>
+              <w:top w:w="120" w:type="dxa"/>
+              <w:bottom w:w="120" w:type="dxa"/>
+              <w:left w:w="120" w:type="dxa"/>
+              <w:right w:w="120" w:type="dxa"/>
+            </w:tcMar>
+          </w:tcPr>
+          <w:p>
+            <w:pPr>
+              <w:spacing w:before="40" w:after="40" w:line="264" w:lineRule="auto"/>
+              <w:jc w:val="left"/>
+            </w:pPr>
+            <w:r>
+              <w:rPr>
+                <w:rFonts w:ascii="Calibri" w:hAnsi="Calibri"/>
+                <w:color w:val="212121"/>
+                <w:sz w:val="19"/>
+              </w:rPr>
+              <w:t>Dispatches simulated email MFA code</w:t>
+            </w:r>
+          </w:p>
+        </w:tc>
+      </w:tr>
+      <w:tr>
+        <w:trPr>
+          <w:cantSplit/>
+        </w:trPr>
+        <w:tc>
+          <w:tcPr>
+            <w:tcW w:type="dxa" w:w="1152"/>
+            <w:shd w:fill="FFFFFF"/>
+            <w:tcMar>
+              <w:top w:w="120" w:type="dxa"/>
+              <w:bottom w:w="120" w:type="dxa"/>
+              <w:left w:w="120" w:type="dxa"/>
+              <w:right w:w="120" w:type="dxa"/>
+            </w:tcMar>
+          </w:tcPr>
+          <w:p>
+            <w:pPr>
+              <w:spacing w:before="40" w:after="40" w:line="264" w:lineRule="auto"/>
+              <w:jc w:val="left"/>
+            </w:pPr>
+            <w:r>
+              <w:rPr>
+                <w:rFonts w:ascii="Calibri" w:hAnsi="Calibri"/>
+                <w:color w:val="212121"/>
+                <w:sz w:val="19"/>
+              </w:rPr>
+              <w:t>POST</w:t>
+            </w:r>
+          </w:p>
+        </w:tc>
+        <w:tc>
+          <w:tcPr>
+            <w:tcW w:type="dxa" w:w="2304"/>
+            <w:shd w:fill="FFFFFF"/>
+            <w:tcMar>
+              <w:top w:w="120" w:type="dxa"/>
+              <w:bottom w:w="120" w:type="dxa"/>
+              <w:left w:w="120" w:type="dxa"/>
+              <w:right w:w="120" w:type="dxa"/>
+            </w:tcMar>
+          </w:tcPr>
+          <w:p>
+            <w:pPr>
+              <w:spacing w:before="40" w:after="40" w:line="264" w:lineRule="auto"/>
+              <w:jc w:val="left"/>
+            </w:pPr>
+            <w:r>
+              <w:rPr>
+                <w:rFonts w:ascii="Calibri" w:hAnsi="Calibri"/>
+                <w:color w:val="212121"/>
+                <w:sz w:val="19"/>
+              </w:rPr>
+              <w:t>/api/auth/verify-otp</w:t>
+            </w:r>
+          </w:p>
+        </w:tc>
+        <w:tc>
+          <w:tcPr>
+            <w:tcW w:type="dxa" w:w="2016"/>
+            <w:shd w:fill="FFFFFF"/>
+            <w:tcMar>
+              <w:top w:w="120" w:type="dxa"/>
+              <w:bottom w:w="120" w:type="dxa"/>
+              <w:left w:w="120" w:type="dxa"/>
+              <w:right w:w="120" w:type="dxa"/>
+            </w:tcMar>
+          </w:tcPr>
+          <w:p>
+            <w:pPr>
+              <w:spacing w:before="40" w:after="40" w:line="264" w:lineRule="auto"/>
+              <w:jc w:val="left"/>
+            </w:pPr>
+            <w:r>
+              <w:rPr>
+                <w:rFonts w:ascii="Calibri" w:hAnsi="Calibri"/>
+                <w:color w:val="212121"/>
+                <w:sz w:val="19"/>
+              </w:rPr>
+              <w:t>auth_controller.js</w:t>
+            </w:r>
+          </w:p>
+        </w:tc>
+        <w:tc>
+          <w:tcPr>
+            <w:tcW w:type="dxa" w:w="1152"/>
+            <w:shd w:fill="FFFFFF"/>
+            <w:tcMar>
+              <w:top w:w="120" w:type="dxa"/>
+              <w:bottom w:w="120" w:type="dxa"/>
+              <w:left w:w="120" w:type="dxa"/>
+              <w:right w:w="120" w:type="dxa"/>
+            </w:tcMar>
+          </w:tcPr>
+          <w:p>
+            <w:pPr>
+              <w:spacing w:before="40" w:after="40" w:line="264" w:lineRule="auto"/>
+              <w:jc w:val="left"/>
+            </w:pPr>
+            <w:r>
+              <w:rPr>
+                <w:rFonts w:ascii="Calibri" w:hAnsi="Calibri"/>
+                <w:color w:val="212121"/>
+                <w:sz w:val="19"/>
+              </w:rPr>
+              <w:t>None</w:t>
+            </w:r>
+          </w:p>
+        </w:tc>
+        <w:tc>
+          <w:tcPr>
+            <w:tcW w:type="dxa" w:w="2736"/>
+            <w:shd w:fill="FFFFFF"/>
+            <w:tcMar>
+              <w:top w:w="120" w:type="dxa"/>
+              <w:bottom w:w="120" w:type="dxa"/>
+              <w:left w:w="120" w:type="dxa"/>
+              <w:right w:w="120" w:type="dxa"/>
+            </w:tcMar>
+          </w:tcPr>
+          <w:p>
+            <w:pPr>
+              <w:spacing w:before="40" w:after="40" w:line="264" w:lineRule="auto"/>
+              <w:jc w:val="left"/>
+            </w:pPr>
+            <w:r>
+              <w:rPr>
+                <w:rFonts w:ascii="Calibri" w:hAnsi="Calibri"/>
+                <w:color w:val="212121"/>
+                <w:sz w:val="19"/>
+              </w:rPr>
+              <w:t>Validates code; flags user verified</w:t>
+            </w:r>
+          </w:p>
+        </w:tc>
+      </w:tr>
+      <w:tr>
+        <w:trPr>
+          <w:cantSplit/>
+        </w:trPr>
+        <w:tc>
+          <w:tcPr>
+            <w:tcW w:type="dxa" w:w="1152"/>
+            <w:shd w:fill="F8FAF8"/>
+            <w:tcMar>
+              <w:top w:w="120" w:type="dxa"/>
+              <w:bottom w:w="120" w:type="dxa"/>
+              <w:left w:w="120" w:type="dxa"/>
+              <w:right w:w="120" w:type="dxa"/>
+            </w:tcMar>
+          </w:tcPr>
+          <w:p>
+            <w:pPr>
+              <w:spacing w:before="40" w:after="40" w:line="264" w:lineRule="auto"/>
+              <w:jc w:val="left"/>
+            </w:pPr>
+            <w:r>
+              <w:rPr>
+                <w:rFonts w:ascii="Calibri" w:hAnsi="Calibri"/>
+                <w:color w:val="212121"/>
+                <w:sz w:val="19"/>
+              </w:rPr>
+              <w:t>GET</w:t>
+            </w:r>
+          </w:p>
+        </w:tc>
+        <w:tc>
+          <w:tcPr>
+            <w:tcW w:type="dxa" w:w="2304"/>
+            <w:shd w:fill="F8FAF8"/>
+            <w:tcMar>
+              <w:top w:w="120" w:type="dxa"/>
+              <w:bottom w:w="120" w:type="dxa"/>
+              <w:left w:w="120" w:type="dxa"/>
+              <w:right w:w="120" w:type="dxa"/>
+            </w:tcMar>
+          </w:tcPr>
+          <w:p>
+            <w:pPr>
+              <w:spacing w:before="40" w:after="40" w:line="264" w:lineRule="auto"/>
+              <w:jc w:val="left"/>
+            </w:pPr>
+            <w:r>
+              <w:rPr>
+                <w:rFonts w:ascii="Calibri" w:hAnsi="Calibri"/>
+                <w:color w:val="212121"/>
+                <w:sz w:val="19"/>
+              </w:rPr>
+              <w:t>/api/auth/me</w:t>
+            </w:r>
+          </w:p>
+        </w:tc>
+        <w:tc>
+          <w:tcPr>
+            <w:tcW w:type="dxa" w:w="2016"/>
+            <w:shd w:fill="F8FAF8"/>
+            <w:tcMar>
+              <w:top w:w="120" w:type="dxa"/>
+              <w:bottom w:w="120" w:type="dxa"/>
+              <w:left w:w="120" w:type="dxa"/>
+              <w:right w:w="120" w:type="dxa"/>
+            </w:tcMar>
+          </w:tcPr>
+          <w:p>
+            <w:pPr>
+              <w:spacing w:before="40" w:after="40" w:line="264" w:lineRule="auto"/>
+              <w:jc w:val="left"/>
+            </w:pPr>
+            <w:r>
+              <w:rPr>
+                <w:rFonts w:ascii="Calibri" w:hAnsi="Calibri"/>
+                <w:color w:val="212121"/>
+                <w:sz w:val="19"/>
+              </w:rPr>
+              <w:t>auth_controller.js</w:t>
+            </w:r>
+          </w:p>
+        </w:tc>
+        <w:tc>
+          <w:tcPr>
+            <w:tcW w:type="dxa" w:w="1152"/>
+            <w:shd w:fill="F8FAF8"/>
+            <w:tcMar>
+              <w:top w:w="120" w:type="dxa"/>
+              <w:bottom w:w="120" w:type="dxa"/>
+              <w:left w:w="120" w:type="dxa"/>
+              <w:right w:w="120" w:type="dxa"/>
+            </w:tcMar>
+          </w:tcPr>
+          <w:p>
+            <w:pPr>
+              <w:spacing w:before="40" w:after="40" w:line="264" w:lineRule="auto"/>
+              <w:jc w:val="left"/>
+            </w:pPr>
+            <w:r>
+              <w:rPr>
+                <w:rFonts w:ascii="Calibri" w:hAnsi="Calibri"/>
+                <w:color w:val="212121"/>
+                <w:sz w:val="19"/>
+              </w:rPr>
+              <w:t>JWT</w:t>
+            </w:r>
+          </w:p>
+        </w:tc>
+        <w:tc>
+          <w:tcPr>
+            <w:tcW w:type="dxa" w:w="2736"/>
+            <w:shd w:fill="F8FAF8"/>
+            <w:tcMar>
+              <w:top w:w="120" w:type="dxa"/>
+              <w:bottom w:w="120" w:type="dxa"/>
+              <w:left w:w="120" w:type="dxa"/>
+              <w:right w:w="120" w:type="dxa"/>
+            </w:tcMar>
+          </w:tcPr>
+          <w:p>
+            <w:pPr>
+              <w:spacing w:before="40" w:after="40" w:line="264" w:lineRule="auto"/>
+              <w:jc w:val="left"/>
+            </w:pPr>
+            <w:r>
+              <w:rPr>
+                <w:rFonts w:ascii="Calibri" w:hAnsi="Calibri"/>
+                <w:color w:val="212121"/>
+                <w:sz w:val="19"/>
+              </w:rPr>
+              <w:t>Returns profile from authenticated JWT payload</w:t>
+            </w:r>
+          </w:p>
+        </w:tc>
+      </w:tr>
+      <w:tr>
+        <w:trPr>
+          <w:cantSplit/>
+        </w:trPr>
+        <w:tc>
+          <w:tcPr>
+            <w:tcW w:type="dxa" w:w="1152"/>
+            <w:shd w:fill="FFFFFF"/>
+            <w:tcMar>
+              <w:top w:w="120" w:type="dxa"/>
+              <w:bottom w:w="120" w:type="dxa"/>
+              <w:left w:w="120" w:type="dxa"/>
+              <w:right w:w="120" w:type="dxa"/>
+            </w:tcMar>
+          </w:tcPr>
+          <w:p>
+            <w:pPr>
+              <w:spacing w:before="40" w:after="40" w:line="264" w:lineRule="auto"/>
+              <w:jc w:val="left"/>
+            </w:pPr>
+            <w:r>
+              <w:rPr>
+                <w:rFonts w:ascii="Calibri" w:hAnsi="Calibri"/>
+                <w:color w:val="212121"/>
+                <w:sz w:val="19"/>
+              </w:rPr>
+              <w:t>POST</w:t>
+            </w:r>
+          </w:p>
+        </w:tc>
+        <w:tc>
+          <w:tcPr>
+            <w:tcW w:type="dxa" w:w="2304"/>
+            <w:shd w:fill="FFFFFF"/>
+            <w:tcMar>
+              <w:top w:w="120" w:type="dxa"/>
+              <w:bottom w:w="120" w:type="dxa"/>
+              <w:left w:w="120" w:type="dxa"/>
+              <w:right w:w="120" w:type="dxa"/>
+            </w:tcMar>
+          </w:tcPr>
+          <w:p>
+            <w:pPr>
+              <w:spacing w:before="40" w:after="40" w:line="264" w:lineRule="auto"/>
+              <w:jc w:val="left"/>
+            </w:pPr>
+            <w:r>
+              <w:rPr>
+                <w:rFonts w:ascii="Calibri" w:hAnsi="Calibri"/>
+                <w:color w:val="212121"/>
+                <w:sz w:val="19"/>
+              </w:rPr>
+              <w:t>/api/upload</w:t>
+            </w:r>
+          </w:p>
+        </w:tc>
+        <w:tc>
+          <w:tcPr>
+            <w:tcW w:type="dxa" w:w="2016"/>
+            <w:shd w:fill="FFFFFF"/>
+            <w:tcMar>
+              <w:top w:w="120" w:type="dxa"/>
+              <w:bottom w:w="120" w:type="dxa"/>
+              <w:left w:w="120" w:type="dxa"/>
+              <w:right w:w="120" w:type="dxa"/>
+            </w:tcMar>
+          </w:tcPr>
+          <w:p>
+            <w:pPr>
+              <w:spacing w:before="40" w:after="40" w:line="264" w:lineRule="auto"/>
+              <w:jc w:val="left"/>
+            </w:pPr>
+            <w:r>
+              <w:rPr>
+                <w:rFonts w:ascii="Calibri" w:hAnsi="Calibri"/>
+                <w:color w:val="212121"/>
+                <w:sz w:val="19"/>
+              </w:rPr>
+              <w:t>upload_controller.js</w:t>
+            </w:r>
+          </w:p>
+        </w:tc>
+        <w:tc>
+          <w:tcPr>
+            <w:tcW w:type="dxa" w:w="1152"/>
+            <w:shd w:fill="FFFFFF"/>
+            <w:tcMar>
+              <w:top w:w="120" w:type="dxa"/>
+              <w:bottom w:w="120" w:type="dxa"/>
+              <w:left w:w="120" w:type="dxa"/>
+              <w:right w:w="120" w:type="dxa"/>
+            </w:tcMar>
+          </w:tcPr>
+          <w:p>
+            <w:pPr>
+              <w:spacing w:before="40" w:after="40" w:line="264" w:lineRule="auto"/>
+              <w:jc w:val="left"/>
+            </w:pPr>
+            <w:r>
+              <w:rPr>
+                <w:rFonts w:ascii="Calibri" w:hAnsi="Calibri"/>
+                <w:color w:val="212121"/>
+                <w:sz w:val="19"/>
+              </w:rPr>
+              <w:t>JWT</w:t>
+            </w:r>
+          </w:p>
+        </w:tc>
+        <w:tc>
+          <w:tcPr>
+            <w:tcW w:type="dxa" w:w="2736"/>
+            <w:shd w:fill="FFFFFF"/>
+            <w:tcMar>
+              <w:top w:w="120" w:type="dxa"/>
+              <w:bottom w:w="120" w:type="dxa"/>
+              <w:left w:w="120" w:type="dxa"/>
+              <w:right w:w="120" w:type="dxa"/>
+            </w:tcMar>
+          </w:tcPr>
+          <w:p>
+            <w:pPr>
+              <w:spacing w:before="40" w:after="40" w:line="264" w:lineRule="auto"/>
+              <w:jc w:val="left"/>
+            </w:pPr>
+            <w:r>
+              <w:rPr>
+                <w:rFonts w:ascii="Calibri" w:hAnsi="Calibri"/>
+                <w:color w:val="212121"/>
+                <w:sz w:val="19"/>
+              </w:rPr>
+              <w:t xml:space="preserve">Handles multipart file streams via </w:t>
+            </w:r>
+            <w:r>
+              <w:rPr>
+                <w:rFonts w:ascii="Calibri" w:hAnsi="Calibri"/>
+                <w:b/>
+                <w:color w:val="212121"/>
+                <w:sz w:val="19"/>
+              </w:rPr>
+              <w:t>Multer</w:t>
+            </w:r>
+            <w:r>
+              <w:rPr>
+                <w:rFonts w:ascii="Calibri" w:hAnsi="Calibri"/>
+                <w:color w:val="212121"/>
+                <w:sz w:val="19"/>
+              </w:rPr>
+            </w:r>
+          </w:p>
+        </w:tc>
+      </w:tr>
+      <w:tr>
+        <w:trPr>
+          <w:cantSplit/>
+        </w:trPr>
+        <w:tc>
+          <w:tcPr>
+            <w:tcW w:type="dxa" w:w="1152"/>
+            <w:shd w:fill="F8FAF8"/>
+            <w:tcMar>
+              <w:top w:w="120" w:type="dxa"/>
+              <w:bottom w:w="120" w:type="dxa"/>
+              <w:left w:w="120" w:type="dxa"/>
+              <w:right w:w="120" w:type="dxa"/>
+            </w:tcMar>
+          </w:tcPr>
+          <w:p>
+            <w:pPr>
+              <w:spacing w:before="40" w:after="40" w:line="264" w:lineRule="auto"/>
+              <w:jc w:val="left"/>
+            </w:pPr>
+            <w:r>
+              <w:rPr>
+                <w:rFonts w:ascii="Calibri" w:hAnsi="Calibri"/>
+                <w:color w:val="212121"/>
+                <w:sz w:val="19"/>
+              </w:rPr>
+              <w:t>POST</w:t>
+            </w:r>
+          </w:p>
+        </w:tc>
+        <w:tc>
+          <w:tcPr>
+            <w:tcW w:type="dxa" w:w="2304"/>
+            <w:shd w:fill="F8FAF8"/>
+            <w:tcMar>
+              <w:top w:w="120" w:type="dxa"/>
+              <w:bottom w:w="120" w:type="dxa"/>
+              <w:left w:w="120" w:type="dxa"/>
+              <w:right w:w="120" w:type="dxa"/>
+            </w:tcMar>
+          </w:tcPr>
+          <w:p>
+            <w:pPr>
+              <w:spacing w:before="40" w:after="40" w:line="264" w:lineRule="auto"/>
+              <w:jc w:val="left"/>
+            </w:pPr>
+            <w:r>
+              <w:rPr>
+                <w:rFonts w:ascii="Calibri" w:hAnsi="Calibri"/>
+                <w:color w:val="212121"/>
+                <w:sz w:val="19"/>
+              </w:rPr>
+              <w:t>/api/analyze</w:t>
+            </w:r>
+          </w:p>
+        </w:tc>
+        <w:tc>
+          <w:tcPr>
+            <w:tcW w:type="dxa" w:w="2016"/>
+            <w:shd w:fill="F8FAF8"/>
+            <w:tcMar>
+              <w:top w:w="120" w:type="dxa"/>
+              <w:bottom w:w="120" w:type="dxa"/>
+              <w:left w:w="120" w:type="dxa"/>
+              <w:right w:w="120" w:type="dxa"/>
+            </w:tcMar>
+          </w:tcPr>
+          <w:p>
+            <w:pPr>
+              <w:spacing w:before="40" w:after="40" w:line="264" w:lineRule="auto"/>
+              <w:jc w:val="left"/>
+            </w:pPr>
+            <w:r>
+              <w:rPr>
+                <w:rFonts w:ascii="Calibri" w:hAnsi="Calibri"/>
+                <w:color w:val="212121"/>
+                <w:sz w:val="19"/>
+              </w:rPr>
+              <w:t>analyze_controller.js</w:t>
+            </w:r>
+          </w:p>
+        </w:tc>
+        <w:tc>
+          <w:tcPr>
+            <w:tcW w:type="dxa" w:w="1152"/>
+            <w:shd w:fill="F8FAF8"/>
+            <w:tcMar>
+              <w:top w:w="120" w:type="dxa"/>
+              <w:bottom w:w="120" w:type="dxa"/>
+              <w:left w:w="120" w:type="dxa"/>
+              <w:right w:w="120" w:type="dxa"/>
+            </w:tcMar>
+          </w:tcPr>
+          <w:p>
+            <w:pPr>
+              <w:spacing w:before="40" w:after="40" w:line="264" w:lineRule="auto"/>
+              <w:jc w:val="left"/>
+            </w:pPr>
+            <w:r>
+              <w:rPr>
+                <w:rFonts w:ascii="Calibri" w:hAnsi="Calibri"/>
+                <w:color w:val="212121"/>
+                <w:sz w:val="19"/>
+              </w:rPr>
+              <w:t>JWT</w:t>
+            </w:r>
+          </w:p>
+        </w:tc>
+        <w:tc>
+          <w:tcPr>
+            <w:tcW w:type="dxa" w:w="2736"/>
+            <w:shd w:fill="F8FAF8"/>
+            <w:tcMar>
+              <w:top w:w="120" w:type="dxa"/>
+              <w:bottom w:w="120" w:type="dxa"/>
+              <w:left w:w="120" w:type="dxa"/>
+              <w:right w:w="120" w:type="dxa"/>
+            </w:tcMar>
+          </w:tcPr>
+          <w:p>
+            <w:pPr>
+              <w:spacing w:before="40" w:after="40" w:line="264" w:lineRule="auto"/>
+              <w:jc w:val="left"/>
+            </w:pPr>
+            <w:r>
+              <w:rPr>
+                <w:rFonts w:ascii="Calibri" w:hAnsi="Calibri"/>
+                <w:color w:val="212121"/>
+                <w:sz w:val="19"/>
+              </w:rPr>
+              <w:t xml:space="preserve">Executes full </w:t>
+            </w:r>
+            <w:r>
+              <w:rPr>
+                <w:rFonts w:ascii="Calibri" w:hAnsi="Calibri"/>
+                <w:b/>
+                <w:color w:val="212121"/>
+                <w:sz w:val="19"/>
+              </w:rPr>
+              <w:t>6-Agent Orchestrator Pipeline</w:t>
+            </w:r>
+            <w:r>
+              <w:rPr>
+                <w:rFonts w:ascii="Calibri" w:hAnsi="Calibri"/>
+                <w:color w:val="212121"/>
+                <w:sz w:val="19"/>
+              </w:rPr>
+            </w:r>
+          </w:p>
+        </w:tc>
+      </w:tr>
+      <w:tr>
+        <w:trPr>
+          <w:cantSplit/>
+        </w:trPr>
+        <w:tc>
+          <w:tcPr>
+            <w:tcW w:type="dxa" w:w="1152"/>
+            <w:shd w:fill="FFFFFF"/>
+            <w:tcMar>
+              <w:top w:w="120" w:type="dxa"/>
+              <w:bottom w:w="120" w:type="dxa"/>
+              <w:left w:w="120" w:type="dxa"/>
+              <w:right w:w="120" w:type="dxa"/>
+            </w:tcMar>
+          </w:tcPr>
+          <w:p>
+            <w:pPr>
+              <w:spacing w:before="40" w:after="40" w:line="264" w:lineRule="auto"/>
+              <w:jc w:val="left"/>
+            </w:pPr>
+            <w:r>
+              <w:rPr>
+                <w:rFonts w:ascii="Calibri" w:hAnsi="Calibri"/>
+                <w:color w:val="212121"/>
+                <w:sz w:val="19"/>
+              </w:rPr>
+              <w:t>GET</w:t>
+            </w:r>
+          </w:p>
+        </w:tc>
+        <w:tc>
+          <w:tcPr>
+            <w:tcW w:type="dxa" w:w="2304"/>
+            <w:shd w:fill="FFFFFF"/>
+            <w:tcMar>
+              <w:top w:w="120" w:type="dxa"/>
+              <w:bottom w:w="120" w:type="dxa"/>
+              <w:left w:w="120" w:type="dxa"/>
+              <w:right w:w="120" w:type="dxa"/>
+            </w:tcMar>
+          </w:tcPr>
+          <w:p>
+            <w:pPr>
+              <w:spacing w:before="40" w:after="40" w:line="264" w:lineRule="auto"/>
+              <w:jc w:val="left"/>
+            </w:pPr>
+            <w:r>
+              <w:rPr>
+                <w:rFonts w:ascii="Calibri" w:hAnsi="Calibri"/>
+                <w:color w:val="212121"/>
+                <w:sz w:val="19"/>
+              </w:rPr>
+              <w:t>/api/weather</w:t>
+            </w:r>
+          </w:p>
+        </w:tc>
+        <w:tc>
+          <w:tcPr>
+            <w:tcW w:type="dxa" w:w="2016"/>
+            <w:shd w:fill="FFFFFF"/>
+            <w:tcMar>
+              <w:top w:w="120" w:type="dxa"/>
+              <w:bottom w:w="120" w:type="dxa"/>
+              <w:left w:w="120" w:type="dxa"/>
+              <w:right w:w="120" w:type="dxa"/>
+            </w:tcMar>
+          </w:tcPr>
+          <w:p>
+            <w:pPr>
+              <w:spacing w:before="40" w:after="40" w:line="264" w:lineRule="auto"/>
+              <w:jc w:val="left"/>
+            </w:pPr>
+            <w:r>
+              <w:rPr>
+                <w:rFonts w:ascii="Calibri" w:hAnsi="Calibri"/>
+                <w:color w:val="212121"/>
+                <w:sz w:val="19"/>
+              </w:rPr>
+              <w:t>weather_controller.js</w:t>
+            </w:r>
+          </w:p>
+        </w:tc>
+        <w:tc>
+          <w:tcPr>
+            <w:tcW w:type="dxa" w:w="1152"/>
+            <w:shd w:fill="FFFFFF"/>
+            <w:tcMar>
+              <w:top w:w="120" w:type="dxa"/>
+              <w:bottom w:w="120" w:type="dxa"/>
+              <w:left w:w="120" w:type="dxa"/>
+              <w:right w:w="120" w:type="dxa"/>
+            </w:tcMar>
+          </w:tcPr>
+          <w:p>
+            <w:pPr>
+              <w:spacing w:before="40" w:after="40" w:line="264" w:lineRule="auto"/>
+              <w:jc w:val="left"/>
+            </w:pPr>
+            <w:r>
+              <w:rPr>
+                <w:rFonts w:ascii="Calibri" w:hAnsi="Calibri"/>
+                <w:color w:val="212121"/>
+                <w:sz w:val="19"/>
+              </w:rPr>
+              <w:t>None</w:t>
+            </w:r>
+          </w:p>
+        </w:tc>
+        <w:tc>
+          <w:tcPr>
+            <w:tcW w:type="dxa" w:w="2736"/>
+            <w:shd w:fill="FFFFFF"/>
+            <w:tcMar>
+              <w:top w:w="120" w:type="dxa"/>
+              <w:bottom w:w="120" w:type="dxa"/>
+              <w:left w:w="120" w:type="dxa"/>
+              <w:right w:w="120" w:type="dxa"/>
+            </w:tcMar>
+          </w:tcPr>
+          <w:p>
+            <w:pPr>
+              <w:spacing w:before="40" w:after="40" w:line="264" w:lineRule="auto"/>
+              <w:jc w:val="left"/>
+            </w:pPr>
+            <w:r>
+              <w:rPr>
+                <w:rFonts w:ascii="Calibri" w:hAnsi="Calibri"/>
+                <w:color w:val="212121"/>
+                <w:sz w:val="19"/>
+              </w:rPr>
+              <w:t>Connects to real-time Open-Meteo weather</w:t>
+            </w:r>
+          </w:p>
+        </w:tc>
+      </w:tr>
+      <w:tr>
+        <w:trPr>
+          <w:cantSplit/>
+        </w:trPr>
+        <w:tc>
+          <w:tcPr>
+            <w:tcW w:type="dxa" w:w="1152"/>
+            <w:shd w:fill="F8FAF8"/>
+            <w:tcMar>
+              <w:top w:w="120" w:type="dxa"/>
+              <w:bottom w:w="120" w:type="dxa"/>
+              <w:left w:w="120" w:type="dxa"/>
+              <w:right w:w="120" w:type="dxa"/>
+            </w:tcMar>
+          </w:tcPr>
+          <w:p>
+            <w:pPr>
+              <w:spacing w:before="40" w:after="40" w:line="264" w:lineRule="auto"/>
+              <w:jc w:val="left"/>
+            </w:pPr>
+            <w:r>
+              <w:rPr>
+                <w:rFonts w:ascii="Calibri" w:hAnsi="Calibri"/>
+                <w:color w:val="212121"/>
+                <w:sz w:val="19"/>
+              </w:rPr>
+              <w:t>POST</w:t>
+            </w:r>
+          </w:p>
+        </w:tc>
+        <w:tc>
+          <w:tcPr>
+            <w:tcW w:type="dxa" w:w="2304"/>
+            <w:shd w:fill="F8FAF8"/>
+            <w:tcMar>
+              <w:top w:w="120" w:type="dxa"/>
+              <w:bottom w:w="120" w:type="dxa"/>
+              <w:left w:w="120" w:type="dxa"/>
+              <w:right w:w="120" w:type="dxa"/>
+            </w:tcMar>
+          </w:tcPr>
+          <w:p>
+            <w:pPr>
+              <w:spacing w:before="40" w:after="40" w:line="264" w:lineRule="auto"/>
+              <w:jc w:val="left"/>
+            </w:pPr>
+            <w:r>
+              <w:rPr>
+                <w:rFonts w:ascii="Calibri" w:hAnsi="Calibri"/>
+                <w:color w:val="212121"/>
+                <w:sz w:val="19"/>
+              </w:rPr>
+              <w:t>/api/actions</w:t>
+            </w:r>
+          </w:p>
+        </w:tc>
+        <w:tc>
+          <w:tcPr>
+            <w:tcW w:type="dxa" w:w="2016"/>
+            <w:shd w:fill="F8FAF8"/>
+            <w:tcMar>
+              <w:top w:w="120" w:type="dxa"/>
+              <w:bottom w:w="120" w:type="dxa"/>
+              <w:left w:w="120" w:type="dxa"/>
+              <w:right w:w="120" w:type="dxa"/>
+            </w:tcMar>
+          </w:tcPr>
+          <w:p>
+            <w:pPr>
+              <w:spacing w:before="40" w:after="40" w:line="264" w:lineRule="auto"/>
+              <w:jc w:val="left"/>
+            </w:pPr>
+            <w:r>
+              <w:rPr>
+                <w:rFonts w:ascii="Calibri" w:hAnsi="Calibri"/>
+                <w:color w:val="212121"/>
+                <w:sz w:val="19"/>
+              </w:rPr>
+              <w:t>actions_controller.js</w:t>
+            </w:r>
+          </w:p>
+        </w:tc>
+        <w:tc>
+          <w:tcPr>
+            <w:tcW w:type="dxa" w:w="1152"/>
+            <w:shd w:fill="F8FAF8"/>
+            <w:tcMar>
+              <w:top w:w="120" w:type="dxa"/>
+              <w:bottom w:w="120" w:type="dxa"/>
+              <w:left w:w="120" w:type="dxa"/>
+              <w:right w:w="120" w:type="dxa"/>
+            </w:tcMar>
+          </w:tcPr>
+          <w:p>
+            <w:pPr>
+              <w:spacing w:before="40" w:after="40" w:line="264" w:lineRule="auto"/>
+              <w:jc w:val="left"/>
+            </w:pPr>
+            <w:r>
+              <w:rPr>
+                <w:rFonts w:ascii="Calibri" w:hAnsi="Calibri"/>
+                <w:color w:val="212121"/>
+                <w:sz w:val="19"/>
+              </w:rPr>
+              <w:t>JWT</w:t>
+            </w:r>
+          </w:p>
+        </w:tc>
+        <w:tc>
+          <w:tcPr>
+            <w:tcW w:type="dxa" w:w="2736"/>
+            <w:shd w:fill="F8FAF8"/>
+            <w:tcMar>
+              <w:top w:w="120" w:type="dxa"/>
+              <w:bottom w:w="120" w:type="dxa"/>
+              <w:left w:w="120" w:type="dxa"/>
+              <w:right w:w="120" w:type="dxa"/>
+            </w:tcMar>
+          </w:tcPr>
+          <w:p>
+            <w:pPr>
+              <w:spacing w:before="40" w:after="40" w:line="264" w:lineRule="auto"/>
+              <w:jc w:val="left"/>
+            </w:pPr>
+            <w:r>
+              <w:rPr>
+                <w:rFonts w:ascii="Calibri" w:hAnsi="Calibri"/>
+                <w:color w:val="212121"/>
+                <w:sz w:val="19"/>
+              </w:rPr>
+              <w:t>Dispatches hardware; tracks mock timeouts</w:t>
+            </w:r>
+          </w:p>
+        </w:tc>
+      </w:tr>
+      <w:tr>
+        <w:trPr>
+          <w:cantSplit/>
+        </w:trPr>
+        <w:tc>
+          <w:tcPr>
+            <w:tcW w:type="dxa" w:w="1152"/>
+            <w:shd w:fill="FFFFFF"/>
+            <w:tcMar>
+              <w:top w:w="120" w:type="dxa"/>
+              <w:bottom w:w="120" w:type="dxa"/>
+              <w:left w:w="120" w:type="dxa"/>
+              <w:right w:w="120" w:type="dxa"/>
+            </w:tcMar>
+          </w:tcPr>
+          <w:p>
+            <w:pPr>
+              <w:spacing w:before="40" w:after="40" w:line="264" w:lineRule="auto"/>
+              <w:jc w:val="left"/>
+            </w:pPr>
+            <w:r>
+              <w:rPr>
+                <w:rFonts w:ascii="Calibri" w:hAnsi="Calibri"/>
+                <w:color w:val="212121"/>
+                <w:sz w:val="19"/>
+              </w:rPr>
+              <w:t>GET</w:t>
+            </w:r>
+          </w:p>
+        </w:tc>
+        <w:tc>
+          <w:tcPr>
+            <w:tcW w:type="dxa" w:w="2304"/>
+            <w:shd w:fill="FFFFFF"/>
+            <w:tcMar>
+              <w:top w:w="120" w:type="dxa"/>
+              <w:bottom w:w="120" w:type="dxa"/>
+              <w:left w:w="120" w:type="dxa"/>
+              <w:right w:w="120" w:type="dxa"/>
+            </w:tcMar>
+          </w:tcPr>
+          <w:p>
+            <w:pPr>
+              <w:spacing w:before="40" w:after="40" w:line="264" w:lineRule="auto"/>
+              <w:jc w:val="left"/>
+            </w:pPr>
+            <w:r>
+              <w:rPr>
+                <w:rFonts w:ascii="Calibri" w:hAnsi="Calibri"/>
+                <w:color w:val="212121"/>
+                <w:sz w:val="19"/>
+              </w:rPr>
+              <w:t>/api/logs</w:t>
+            </w:r>
+          </w:p>
+        </w:tc>
+        <w:tc>
+          <w:tcPr>
+            <w:tcW w:type="dxa" w:w="2016"/>
+            <w:shd w:fill="FFFFFF"/>
+            <w:tcMar>
+              <w:top w:w="120" w:type="dxa"/>
+              <w:bottom w:w="120" w:type="dxa"/>
+              <w:left w:w="120" w:type="dxa"/>
+              <w:right w:w="120" w:type="dxa"/>
+            </w:tcMar>
+          </w:tcPr>
+          <w:p>
+            <w:pPr>
+              <w:spacing w:before="40" w:after="40" w:line="264" w:lineRule="auto"/>
+              <w:jc w:val="left"/>
+            </w:pPr>
+            <w:r>
+              <w:rPr>
+                <w:rFonts w:ascii="Calibri" w:hAnsi="Calibri"/>
+                <w:color w:val="212121"/>
+                <w:sz w:val="19"/>
+              </w:rPr>
+              <w:t>logs_controller.js</w:t>
+            </w:r>
+          </w:p>
+        </w:tc>
+        <w:tc>
+          <w:tcPr>
+            <w:tcW w:type="dxa" w:w="1152"/>
+            <w:shd w:fill="FFFFFF"/>
+            <w:tcMar>
+              <w:top w:w="120" w:type="dxa"/>
+              <w:bottom w:w="120" w:type="dxa"/>
+              <w:left w:w="120" w:type="dxa"/>
+              <w:right w:w="120" w:type="dxa"/>
+            </w:tcMar>
+          </w:tcPr>
+          <w:p>
+            <w:pPr>
+              <w:spacing w:before="40" w:after="40" w:line="264" w:lineRule="auto"/>
+              <w:jc w:val="left"/>
+            </w:pPr>
+            <w:r>
+              <w:rPr>
+                <w:rFonts w:ascii="Calibri" w:hAnsi="Calibri"/>
+                <w:color w:val="212121"/>
+                <w:sz w:val="19"/>
+              </w:rPr>
+              <w:t>JWT</w:t>
+            </w:r>
+          </w:p>
+        </w:tc>
+        <w:tc>
+          <w:tcPr>
+            <w:tcW w:type="dxa" w:w="2736"/>
+            <w:shd w:fill="FFFFFF"/>
+            <w:tcMar>
+              <w:top w:w="120" w:type="dxa"/>
+              <w:bottom w:w="120" w:type="dxa"/>
+              <w:left w:w="120" w:type="dxa"/>
+              <w:right w:w="120" w:type="dxa"/>
+            </w:tcMar>
+          </w:tcPr>
+          <w:p>
+            <w:pPr>
+              <w:spacing w:before="40" w:after="40" w:line="264" w:lineRule="auto"/>
+              <w:jc w:val="left"/>
+            </w:pPr>
+            <w:r>
+              <w:rPr>
+                <w:rFonts w:ascii="Calibri" w:hAnsi="Calibri"/>
+                <w:color w:val="212121"/>
+                <w:sz w:val="19"/>
+              </w:rPr>
+              <w:t>Streams step-by-step diagnostic telemetry traces</w:t>
+            </w:r>
+          </w:p>
+        </w:tc>
+      </w:tr>
+      <w:tr>
+        <w:trPr>
+          <w:cantSplit/>
+        </w:trPr>
+        <w:tc>
+          <w:tcPr>
+            <w:tcW w:type="dxa" w:w="1152"/>
+            <w:shd w:fill="F8FAF8"/>
+            <w:tcMar>
+              <w:top w:w="120" w:type="dxa"/>
+              <w:bottom w:w="120" w:type="dxa"/>
+              <w:left w:w="120" w:type="dxa"/>
+              <w:right w:w="120" w:type="dxa"/>
+            </w:tcMar>
+          </w:tcPr>
+          <w:p>
+            <w:pPr>
+              <w:spacing w:before="40" w:after="40" w:line="264" w:lineRule="auto"/>
+              <w:jc w:val="left"/>
+            </w:pPr>
+            <w:r>
+              <w:rPr>
+                <w:rFonts w:ascii="Calibri" w:hAnsi="Calibri"/>
+                <w:color w:val="212121"/>
+                <w:sz w:val="19"/>
+              </w:rPr>
+              <w:t>GET</w:t>
+            </w:r>
+          </w:p>
+        </w:tc>
+        <w:tc>
+          <w:tcPr>
+            <w:tcW w:type="dxa" w:w="2304"/>
+            <w:shd w:fill="F8FAF8"/>
+            <w:tcMar>
+              <w:top w:w="120" w:type="dxa"/>
+              <w:bottom w:w="120" w:type="dxa"/>
+              <w:left w:w="120" w:type="dxa"/>
+              <w:right w:w="120" w:type="dxa"/>
+            </w:tcMar>
+          </w:tcPr>
+          <w:p>
+            <w:pPr>
+              <w:spacing w:before="40" w:after="40" w:line="264" w:lineRule="auto"/>
+              <w:jc w:val="left"/>
+            </w:pPr>
+            <w:r>
+              <w:rPr>
+                <w:rFonts w:ascii="Calibri" w:hAnsi="Calibri"/>
+                <w:color w:val="212121"/>
+                <w:sz w:val="19"/>
+              </w:rPr>
+              <w:t>/api/dashboard</w:t>
+            </w:r>
+          </w:p>
+        </w:tc>
+        <w:tc>
+          <w:tcPr>
+            <w:tcW w:type="dxa" w:w="2016"/>
+            <w:shd w:fill="F8FAF8"/>
+            <w:tcMar>
+              <w:top w:w="120" w:type="dxa"/>
+              <w:bottom w:w="120" w:type="dxa"/>
+              <w:left w:w="120" w:type="dxa"/>
+              <w:right w:w="120" w:type="dxa"/>
+            </w:tcMar>
+          </w:tcPr>
+          <w:p>
+            <w:pPr>
+              <w:spacing w:before="40" w:after="40" w:line="264" w:lineRule="auto"/>
+              <w:jc w:val="left"/>
+            </w:pPr>
+            <w:r>
+              <w:rPr>
+                <w:rFonts w:ascii="Calibri" w:hAnsi="Calibri"/>
+                <w:color w:val="212121"/>
+                <w:sz w:val="19"/>
+              </w:rPr>
+              <w:t>dashboard_controller.js</w:t>
+            </w:r>
+          </w:p>
+        </w:tc>
+        <w:tc>
+          <w:tcPr>
+            <w:tcW w:type="dxa" w:w="1152"/>
+            <w:shd w:fill="F8FAF8"/>
+            <w:tcMar>
+              <w:top w:w="120" w:type="dxa"/>
+              <w:bottom w:w="120" w:type="dxa"/>
+              <w:left w:w="120" w:type="dxa"/>
+              <w:right w:w="120" w:type="dxa"/>
+            </w:tcMar>
+          </w:tcPr>
+          <w:p>
+            <w:pPr>
+              <w:spacing w:before="40" w:after="40" w:line="264" w:lineRule="auto"/>
+              <w:jc w:val="left"/>
+            </w:pPr>
+            <w:r>
+              <w:rPr>
+                <w:rFonts w:ascii="Calibri" w:hAnsi="Calibri"/>
+                <w:color w:val="212121"/>
+                <w:sz w:val="19"/>
+              </w:rPr>
+              <w:t>JWT</w:t>
+            </w:r>
+          </w:p>
+        </w:tc>
+        <w:tc>
+          <w:tcPr>
+            <w:tcW w:type="dxa" w:w="2736"/>
+            <w:shd w:fill="F8FAF8"/>
+            <w:tcMar>
+              <w:top w:w="120" w:type="dxa"/>
+              <w:bottom w:w="120" w:type="dxa"/>
+              <w:left w:w="120" w:type="dxa"/>
+              <w:right w:w="120" w:type="dxa"/>
+            </w:tcMar>
+          </w:tcPr>
+          <w:p>
+            <w:pPr>
+              <w:spacing w:before="40" w:after="40" w:line="264" w:lineRule="auto"/>
+              <w:jc w:val="left"/>
+            </w:pPr>
+            <w:r>
+              <w:rPr>
+                <w:rFonts w:ascii="Calibri" w:hAnsi="Calibri"/>
+                <w:color w:val="212121"/>
+                <w:sz w:val="19"/>
+              </w:rPr>
+              <w:t>Pulls charts history &amp; flashing alerts data</w:t>
+            </w:r>
+          </w:p>
+        </w:tc>
+      </w:tr>
+    </w:tbl>
+    <w:p>
+      <w:pPr>
+        <w:spacing w:before="0" w:after="240"/>
+      </w:pPr>
+    </w:p>
+    <w:p>
+      <w:pPr>
+        <w:pStyle w:val="Heading1"/>
+        <w:keepNext/>
+        <w:spacing w:before="440" w:after="200"/>
+      </w:pPr>
       <w:r>
         <w:rPr>
+          <w:rFonts w:ascii="Calibri Light" w:hAnsi="Calibri Light"/>
           <w:b/>
+          <w:color w:val="1B5E20"/>
+          <w:sz w:val="40"/>
         </w:rPr>
-        <w:t>Tech Stack:</w:t>
-      </w:r>
-      <w:r>
-        <w:t xml:space="preserve"> React (v19), Vite, Tailwind CSS v4, Lucide React, Axios, and Recharts.</w:t>
+        <w:t>5. Resiliency, Failsafe &amp; Rollback Protocols</w:t>
       </w:r>
     </w:p>
     <w:p>
       <w:pPr>
-        <w:pStyle w:val="ListBullet"/>
-        <w:spacing w:after="60"/>
+        <w:spacing w:before="0" w:after="120" w:line="276" w:lineRule="auto"/>
       </w:pPr>
-      <w:r/>
       <w:r>
-        <w:rPr>
-          <w:b/>
-        </w:rPr>
-        <w:t>Secure Authentication &amp; MFA OTP System:</w:t>
-      </w:r>
-      <w:r/>
-    </w:p>
-    <w:p>
-      <w:pPr>
-        <w:pStyle w:val="ListBullet"/>
-        <w:spacing w:after="60"/>
-      </w:pPr>
-      <w:r/>
-      <w:r>
-        <w:rPr>
-          <w:b/>
-        </w:rPr>
-        <w:t>Email &amp; Password Auth:</w:t>
-      </w:r>
-      <w:r>
-        <w:t xml:space="preserve"> Full registration and sign-in interfaces.</w:t>
+        <w:t>To prevent expensive crop loss or chemical leaks, ArgoGuard AI implements a robust, stateful Failsafe Recovery service (recovery_service.js). The system isolates faults and triggers active defenses in sequence:</w:t>
       </w:r>
     </w:p>
     <w:p>
       <w:pPr>
-        <w:pStyle w:val="ListBullet"/>
-        <w:spacing w:after="60"/>
+        <w:spacing w:before="0" w:after="120" w:line="276" w:lineRule="auto"/>
       </w:pPr>
-      <w:r/>
       <w:r>
-        <w:rPr>
-          <w:b/>
-        </w:rPr>
-        <w:t>Multi-Factor OTP Verification:</w:t>
-      </w:r>
-      <w:r>
-        <w:t xml:space="preserve"> Restricts access until a 6-digit OTP code is validated. The system calls `/auth/send-otp` and `/auth/verify-otp` endpoints, with automatic offline simulated code generation and master key bypass triggers.</w:t>
+        <w:t>1. Fault Detection: The Action Service issues a request to a hardware valve or sprinkler controller.</w:t>
+        <w:br/>
+        <w:t>2. Retries with Backoff: If the connection experiences transient timeouts or 500 errors, the engine attempts up to 3 retries using an exponential backoff algorithm.</w:t>
+        <w:br/>
+        <w:t>3. Redundant Controller Routing: If retries are exhausted, the system attempts to route the action via an alternate, independent physical controller interface.</w:t>
+        <w:br/>
+        <w:t xml:space="preserve">4. Stateful System Rollback: If all controllers are unreachable, the Recovery Agent marks the event as an emergency [ROLLBACK] and actively: </w:t>
+        <w:br/>
+        <w:t xml:space="preserve">   • Resets simulated reservoirs to prevent double-dosing.</w:t>
+        <w:br/>
+        <w:t xml:space="preserve">   • Sends safety overrides to close physical actuator valves.</w:t>
+        <w:br/>
+        <w:t xml:space="preserve">   • Details the exact rollback telemetry path in log tables.</w:t>
+        <w:br/>
+        <w:t xml:space="preserve">   • Dispatches high-priority push notifications to all connected frontends.</w:t>
       </w:r>
     </w:p>
     <w:p>
       <w:pPr>
-        <w:pStyle w:val="ListBullet"/>
-        <w:spacing w:after="60"/>
+        <w:pStyle w:val="Heading2"/>
+        <w:keepNext/>
+        <w:spacing w:before="320" w:after="160"/>
       </w:pPr>
-      <w:r/>
       <w:r>
         <w:rPr>
+          <w:rFonts w:ascii="Calibri Light" w:hAnsi="Calibri Light"/>
           <w:b/>
+          <w:color w:val="37474F"/>
+          <w:sz w:val="28"/>
         </w:rPr>
-        <w:t>Social Sign-In Integration:</w:t>
+        <w:t>5.1 Failsafe Sequence Flow</w:t>
       </w:r>
+    </w:p>
+    <w:tbl>
+      <w:tblPr>
+        <w:tblW w:type="auto" w:w="0"/>
+        <w:jc w:val="center"/>
+        <w:tblLayout w:type="fixed"/>
+        <w:tblLook w:firstColumn="1" w:firstRow="1" w:lastColumn="0" w:lastRow="0" w:noHBand="0" w:noVBand="1" w:val="04A0"/>
+        <w:tblBorders>
+          <w:top w:val="single" w:sz="4" w:space="0" w:color="CFD8DC"/>
+          <w:left w:val="single" w:sz="4" w:space="0" w:color="CFD8DC"/>
+          <w:bottom w:val="single" w:sz="4" w:space="0" w:color="CFD8DC"/>
+          <w:right w:val="single" w:sz="4" w:space="0" w:color="CFD8DC"/>
+          <w:insideH w:val="single" w:sz="4" w:space="0" w:color="CFD8DC"/>
+          <w:insideV w:val="single" w:sz="4" w:space="0" w:color="CFD8DC"/>
+        </w:tblBorders>
+      </w:tblPr>
+      <w:tblGrid>
+        <w:gridCol w:w="9360"/>
+      </w:tblGrid>
+      <w:tr>
+        <w:tc>
+          <w:tcPr>
+            <w:tcW w:type="dxa" w:w="9360"/>
+            <w:shd w:fill="ECEFF1"/>
+            <w:tcMar>
+              <w:top w:w="120" w:type="dxa"/>
+              <w:bottom w:w="120" w:type="dxa"/>
+              <w:left w:w="160" w:type="dxa"/>
+              <w:right w:w="160" w:type="dxa"/>
+            </w:tcMar>
+          </w:tcPr>
+          <w:p>
+            <w:pPr>
+              <w:spacing w:before="40" w:after="40" w:line="240" w:lineRule="auto"/>
+            </w:pPr>
+            <w:r>
+              <w:rPr>
+                <w:rFonts w:ascii="Consolas" w:hAnsi="Consolas"/>
+                <w:color w:val="263238"/>
+                <w:sz w:val="17"/>
+              </w:rPr>
+              <w:t>[Web Cockpit] ────────────────────────── Trigger Action ───────────────────────────&gt; [Action Service]</w:t>
+              <w:br/>
+              <w:t xml:space="preserve">                                                                                           │</w:t>
+              <w:br/>
+              <w:t xml:space="preserve">                                                                                 (Primary Controller API)</w:t>
+              <w:br/>
+              <w:t xml:space="preserve">                                                                                           │</w:t>
+              <w:br/>
+              <w:t xml:space="preserve">                                                                             ┌─────────────┴─────────────┐</w:t>
+              <w:br/>
+              <w:t xml:space="preserve">                                                                             ▼                           ▼</w:t>
+              <w:br/>
+              <w:t xml:space="preserve">                                                                         [Success]                   [Timeout / 500]</w:t>
+              <w:br/>
+              <w:t xml:space="preserve">                                                                             │                           │</w:t>
+              <w:br/>
+              <w:t xml:space="preserve">                                                                         [Confirmed]             (Retry 3x Backoff)</w:t>
+              <w:br/>
+              <w:t xml:space="preserve">                                                                                                         │</w:t>
+              <w:br/>
+              <w:t xml:space="preserve">                                                                                                 ┌───────┴───────┐</w:t>
+              <w:br/>
+              <w:t xml:space="preserve">                                                                                                 ▼               ▼</w:t>
+              <w:br/>
+              <w:t xml:space="preserve">                                                                                             [Success]       [Failed]</w:t>
+              <w:br/>
+              <w:t xml:space="preserve">                                                                                                 │               │</w:t>
+              <w:br/>
+              <w:t xml:space="preserve">                                                                                             [Success Alert] (Failover Alternate)</w:t>
+              <w:br/>
+              <w:t xml:space="preserve">                                                                                                                 │</w:t>
+              <w:br/>
+              <w:t xml:space="preserve">                                                                                                         ┌───────┴───────┐</w:t>
+              <w:br/>
+              <w:t xml:space="preserve">                                                                                                         ▼               ▼</w:t>
+              <w:br/>
+              <w:t xml:space="preserve">                                                                                                     [Success]       [Failed]</w:t>
+              <w:br/>
+              <w:t xml:space="preserve">                                                                                                         │               │</w:t>
+              <w:br/>
+              <w:t xml:space="preserve">                                                                                                   [Fallback OK]   (State Rollback)</w:t>
+              <w:br/>
+              <w:t xml:space="preserve">                                                                                                                         │</w:t>
+              <w:br/>
+              <w:t xml:space="preserve">                                                                                                                         ▼</w:t>
+              <w:br/>
+              <w:t xml:space="preserve">                                                                                                                 - Reset Reservoirs</w:t>
+              <w:br/>
+              <w:t xml:space="preserve">                                                                                                                 - Lock Valves Hard</w:t>
+              <w:br/>
+              <w:t xml:space="preserve">                                                                                                                 - Push Alert to Client</w:t>
+            </w:r>
+          </w:p>
+        </w:tc>
+      </w:tr>
+    </w:tbl>
+    <w:p>
+      <w:pPr>
+        <w:spacing w:before="0" w:after="160"/>
+      </w:pPr>
+    </w:p>
+    <w:p>
+      <w:pPr>
+        <w:spacing w:before="0" w:after="120" w:line="276" w:lineRule="auto"/>
+      </w:pPr>
       <w:r>
-        <w:t xml:space="preserve"> Custom styled Google and Facebook OAuth buttons mapping to the MERN backend `/auth/social-login` controller.</w:t>
+        <w:t>Developers can review the exact architectural message-pass layout using the following Mermaid markup:</w:t>
+      </w:r>
+    </w:p>
+    <w:tbl>
+      <w:tblPr>
+        <w:tblW w:type="auto" w:w="0"/>
+        <w:jc w:val="center"/>
+        <w:tblLayout w:type="fixed"/>
+        <w:tblLook w:firstColumn="1" w:firstRow="1" w:lastColumn="0" w:lastRow="0" w:noHBand="0" w:noVBand="1" w:val="04A0"/>
+        <w:tblBorders>
+          <w:top w:val="single" w:sz="4" w:space="0" w:color="CFD8DC"/>
+          <w:left w:val="single" w:sz="4" w:space="0" w:color="CFD8DC"/>
+          <w:bottom w:val="single" w:sz="4" w:space="0" w:color="CFD8DC"/>
+          <w:right w:val="single" w:sz="4" w:space="0" w:color="CFD8DC"/>
+          <w:insideH w:val="single" w:sz="4" w:space="0" w:color="CFD8DC"/>
+          <w:insideV w:val="single" w:sz="4" w:space="0" w:color="CFD8DC"/>
+        </w:tblBorders>
+      </w:tblPr>
+      <w:tblGrid>
+        <w:gridCol w:w="9360"/>
+      </w:tblGrid>
+      <w:tr>
+        <w:tc>
+          <w:tcPr>
+            <w:tcW w:type="dxa" w:w="9360"/>
+            <w:shd w:fill="ECEFF1"/>
+            <w:tcMar>
+              <w:top w:w="120" w:type="dxa"/>
+              <w:bottom w:w="120" w:type="dxa"/>
+              <w:left w:w="160" w:type="dxa"/>
+              <w:right w:w="160" w:type="dxa"/>
+            </w:tcMar>
+          </w:tcPr>
+          <w:p>
+            <w:pPr>
+              <w:spacing w:before="40" w:after="40" w:line="240" w:lineRule="auto"/>
+            </w:pPr>
+            <w:r>
+              <w:rPr>
+                <w:rFonts w:ascii="Consolas" w:hAnsi="Consolas"/>
+                <w:color w:val="263238"/>
+                <w:sz w:val="17"/>
+              </w:rPr>
+              <w:t>sequenceDiagram</w:t>
+              <w:br/>
+              <w:t xml:space="preserve">    WebDashboard-&gt;&gt;ActionService: Trigger Emergency Order</w:t>
+              <w:br/>
+              <w:t xml:space="preserve">    ActionService-&gt;&gt;PrimarySupplier: Send Dispatch Request</w:t>
+              <w:br/>
+              <w:t xml:space="preserve">    alt Primary Supplier API Fails or Times Out</w:t>
+              <w:br/>
+              <w:t xml:space="preserve">        PrimarySupplier--&gt;&gt;ActionService: 500 Error / Timeout</w:t>
+              <w:br/>
+              <w:t xml:space="preserve">        ActionService-&gt;&gt;FailsafeEngine: Log Incident &amp; Trigger Retry Sequence</w:t>
+              <w:br/>
+              <w:t xml:space="preserve">        FailsafeEngine-&gt;&gt;ActionService: Authorize Failover Supplier</w:t>
+              <w:br/>
+              <w:t xml:space="preserve">        ActionService-&gt;&gt;FallbackSupplier: Send Dispatch Request to Fallback</w:t>
+              <w:br/>
+              <w:t xml:space="preserve">        FallbackSupplier--&gt;&gt;ActionService: Order Confirmed</w:t>
+              <w:br/>
+              <w:t xml:space="preserve">        ActionService--&gt;&gt;WebDashboard: Confirmed via Fallback (Success Alert)</w:t>
+              <w:br/>
+              <w:t xml:space="preserve">    else Primary and Fallback Both Fail (Rollback)</w:t>
+              <w:br/>
+              <w:t xml:space="preserve">        FallbackSupplier--&gt;&gt;ActionService: Failed / Permanent Timeout</w:t>
+              <w:br/>
+              <w:t xml:space="preserve">        ActionService-&gt;&gt;FailsafeEngine: Trigger Rollback Protocol</w:t>
+              <w:br/>
+              <w:t xml:space="preserve">        FailsafeEngine-&gt;&gt;FailsafeEngine: Release Inventories, Unlock Valves &amp; Log Diagnostics</w:t>
+              <w:br/>
+              <w:t xml:space="preserve">        ActionService--&gt;&gt;WebDashboard: Transaction Aborted &amp; Rollback Audited (Error Alert)</w:t>
+              <w:br/>
+              <w:t xml:space="preserve">    end</w:t>
+            </w:r>
+          </w:p>
+        </w:tc>
+      </w:tr>
+    </w:tbl>
+    <w:p>
+      <w:pPr>
+        <w:spacing w:before="0" w:after="160"/>
+      </w:pPr>
+    </w:p>
+    <w:p>
+      <w:pPr>
+        <w:pStyle w:val="Heading1"/>
+        <w:keepNext/>
+        <w:spacing w:before="440" w:after="200"/>
+      </w:pPr>
+      <w:r>
+        <w:rPr>
+          <w:rFonts w:ascii="Calibri Light" w:hAnsi="Calibri Light"/>
+          <w:b/>
+          <w:color w:val="1B5E20"/>
+          <w:sz w:val="40"/>
+        </w:rPr>
+        <w:t>6. Development &amp; Deployment Guidelines</w:t>
       </w:r>
     </w:p>
     <w:p>
       <w:pPr>
-        <w:pStyle w:val="ListBullet"/>
-        <w:spacing w:after="60"/>
+        <w:spacing w:before="0" w:after="120" w:line="276" w:lineRule="auto"/>
       </w:pPr>
-      <w:r/>
       <w:r>
-        <w:rPr>
-          <w:b/>
-        </w:rPr>
-        <w:t>Persistent Sessions:</w:t>
-      </w:r>
-      <w:r>
-        <w:t xml:space="preserve"> Implements JWT-based token verification against `/auth/me` on startup.</w:t>
+        <w:t>ArgoGuard AI is designed for seamless, multi-environment deployments. Follow these commands to spin up a local instance for development, testing, or sandboxed simulations:</w:t>
       </w:r>
     </w:p>
     <w:p>
       <w:pPr>
-        <w:pStyle w:val="ListBullet"/>
-        <w:spacing w:after="60"/>
+        <w:pStyle w:val="Heading2"/>
+        <w:keepNext/>
+        <w:spacing w:before="320" w:after="160"/>
       </w:pPr>
-      <w:r/>
       <w:r>
         <w:rPr>
+          <w:rFonts w:ascii="Calibri Light" w:hAnsi="Calibri Light"/>
           <w:b/>
+          <w:color w:val="37474F"/>
+          <w:sz w:val="28"/>
         </w:rPr>
-        <w:t>Observability Cockpit:</w:t>
+        <w:t>6.1 Startup Command Sequence</w:t>
       </w:r>
+    </w:p>
+    <w:tbl>
+      <w:tblPr>
+        <w:tblW w:type="auto" w:w="0"/>
+        <w:jc w:val="center"/>
+        <w:tblLayout w:type="fixed"/>
+        <w:tblLook w:firstColumn="1" w:firstRow="1" w:lastColumn="0" w:lastRow="0" w:noHBand="0" w:noVBand="1" w:val="04A0"/>
+        <w:tblBorders>
+          <w:top w:val="single" w:sz="4" w:space="0" w:color="CFD8DC"/>
+          <w:left w:val="single" w:sz="4" w:space="0" w:color="CFD8DC"/>
+          <w:bottom w:val="single" w:sz="4" w:space="0" w:color="CFD8DC"/>
+          <w:right w:val="single" w:sz="4" w:space="0" w:color="CFD8DC"/>
+          <w:insideH w:val="single" w:sz="4" w:space="0" w:color="CFD8DC"/>
+          <w:insideV w:val="single" w:sz="4" w:space="0" w:color="CFD8DC"/>
+        </w:tblBorders>
+      </w:tblPr>
+      <w:tblGrid>
+        <w:gridCol w:w="9360"/>
+      </w:tblGrid>
+      <w:tr>
+        <w:tc>
+          <w:tcPr>
+            <w:tcW w:type="dxa" w:w="9360"/>
+            <w:shd w:fill="ECEFF1"/>
+            <w:tcMar>
+              <w:top w:w="120" w:type="dxa"/>
+              <w:bottom w:w="120" w:type="dxa"/>
+              <w:left w:w="160" w:type="dxa"/>
+              <w:right w:w="160" w:type="dxa"/>
+            </w:tcMar>
+          </w:tcPr>
+          <w:p>
+            <w:pPr>
+              <w:spacing w:before="40" w:after="40" w:line="240" w:lineRule="auto"/>
+            </w:pPr>
+            <w:r>
+              <w:rPr>
+                <w:rFonts w:ascii="Consolas" w:hAnsi="Consolas"/>
+                <w:color w:val="263238"/>
+                <w:sz w:val="17"/>
+              </w:rPr>
+              <w:t># 1. Start the Express Backend API Server</w:t>
+              <w:br/>
+              <w:t>cd backend</w:t>
+              <w:br/>
+              <w:t>npm install</w:t>
+              <w:br/>
+              <w:t>npm run dev</w:t>
+              <w:br/>
+              <w:br/>
+              <w:t># 2. Launch the React Web Cockpit</w:t>
+              <w:br/>
+              <w:t>cd ../frontend</w:t>
+              <w:br/>
+              <w:t>npm install</w:t>
+              <w:br/>
+              <w:t>npm run dev</w:t>
+              <w:br/>
+              <w:br/>
+              <w:t># 3. Run the Flutter Mobile Companion</w:t>
+              <w:br/>
+              <w:t>cd ..</w:t>
+              <w:br/>
+              <w:t>flutter pub get</w:t>
+              <w:br/>
+              <w:t>flutter run</w:t>
+            </w:r>
+          </w:p>
+        </w:tc>
+      </w:tr>
+    </w:tbl>
+    <w:p>
+      <w:pPr>
+        <w:spacing w:before="0" w:after="160"/>
+      </w:pPr>
+    </w:p>
+    <w:p>
+      <w:pPr>
+        <w:pStyle w:val="Heading1"/>
+        <w:keepNext/>
+        <w:spacing w:before="440" w:after="200"/>
+      </w:pPr>
       <w:r>
-        <w:t xml:space="preserve"> Features interactive 6-Agent pipeline diagnostics with telemetry logs, side-by-side diseased foliage comparison sliders, and dynamic hardware failover/rollback execution sandboxes.</w:t>
+        <w:rPr>
+          <w:rFonts w:ascii="Calibri Light" w:hAnsi="Calibri Light"/>
+          <w:b/>
+          <w:color w:val="1B5E20"/>
+          <w:sz w:val="40"/>
+        </w:rPr>
+        <w:t>7. Architectural Summary</w:t>
       </w:r>
     </w:p>
     <w:p>
       <w:pPr>
-        <w:spacing w:before="160" w:after="40"/>
+        <w:spacing w:before="0" w:after="120" w:line="276" w:lineRule="auto"/>
       </w:pPr>
       <w:r>
-        <w:rPr>
-          <w:b/>
-          <w:i/>
-          <w:color w:val="334155"/>
-          <w:sz w:val="22"/>
-        </w:rPr>
-        <w:t>B. 📱 Flutter Mobile App (On-Field Companion) (Located inside `/lib`, `/android`, `/ios`)</w:t>
-      </w:r>
-    </w:p>
-    <w:p>
-      <w:pPr>
-        <w:pStyle w:val="ListBullet"/>
-        <w:spacing w:after="60"/>
-      </w:pPr>
-      <w:r/>
-      <w:r>
-        <w:rPr>
-          <w:b/>
-        </w:rPr>
-        <w:t>Purpose:</w:t>
-      </w:r>
-      <w:r>
-        <w:t xml:space="preserve"> Pocket-sized mobile app for field operators.</w:t>
-      </w:r>
-    </w:p>
-    <w:p>
-      <w:pPr>
-        <w:pStyle w:val="ListBullet"/>
-        <w:spacing w:after="60"/>
-      </w:pPr>
-      <w:r/>
-      <w:r>
-        <w:rPr>
-          <w:b/>
-        </w:rPr>
-        <w:t>Tech Stack:</w:t>
-      </w:r>
-      <w:r>
-        <w:t xml:space="preserve"> Flutter / Dart</w:t>
-      </w:r>
-    </w:p>
-    <w:p>
-      <w:pPr>
-        <w:pStyle w:val="ListBullet"/>
-        <w:spacing w:after="60"/>
-      </w:pPr>
-      <w:r>
-        <w:t xml:space="preserve">-   </w:t>
-      </w:r>
-      <w:r>
-        <w:rPr>
-          <w:b/>
-        </w:rPr>
-        <w:t>State Management:</w:t>
-      </w:r>
-      <w:r>
-        <w:t xml:space="preserve"> `Provider` architecture for reactive UI updates (`AuthProvider`, `AnalysisProvider`, `WeatherProvider`).</w:t>
-      </w:r>
-    </w:p>
-    <w:p>
-      <w:pPr>
-        <w:pStyle w:val="ListBullet"/>
-        <w:spacing w:after="60"/>
-      </w:pPr>
-      <w:r>
-        <w:t xml:space="preserve">-   </w:t>
-      </w:r>
-      <w:r>
-        <w:rPr>
-          <w:b/>
-        </w:rPr>
-        <w:t>UI/UX:</w:t>
-      </w:r>
-      <w:r>
-        <w:t xml:space="preserve"> A highly modern, premium glassmorphic interface with rich animations, responsive layouts, and intuitive dashboards.</w:t>
-      </w:r>
-    </w:p>
-    <w:p>
-      <w:pPr>
-        <w:pStyle w:val="ListBullet"/>
-        <w:spacing w:after="60"/>
-      </w:pPr>
-      <w:r>
-        <w:t xml:space="preserve">-   </w:t>
-      </w:r>
-      <w:r>
-        <w:rPr>
-          <w:b/>
-        </w:rPr>
-        <w:t>Key Modules:</w:t>
-      </w:r>
-      <w:r>
-        <w:t xml:space="preserve"> Dashboard (Weather &amp; Stats), Camera Upload/Scan, Active Alerts, Notification History, and detailed AI Analysis breakdown.</w:t>
-      </w:r>
-    </w:p>
-    <w:p>
-      <w:pPr>
-        <w:spacing w:before="200" w:after="80"/>
-      </w:pPr>
-      <w:r>
-        <w:rPr>
-          <w:b/>
-          <w:color w:val="10B981"/>
-          <w:sz w:val="25"/>
-        </w:rPr>
-        <w:t>Backend (Server)</w:t>
-      </w:r>
-    </w:p>
-    <w:p>
-      <w:pPr>
-        <w:pStyle w:val="ListBullet"/>
-        <w:spacing w:after="60"/>
-      </w:pPr>
-      <w:r/>
-      <w:r>
-        <w:rPr>
-          <w:b/>
-        </w:rPr>
-        <w:t>Framework:</w:t>
-      </w:r>
-      <w:r>
-        <w:t xml:space="preserve"> Node.js with Express.js</w:t>
-      </w:r>
-    </w:p>
-    <w:p>
-      <w:pPr>
-        <w:pStyle w:val="ListBullet"/>
-        <w:spacing w:after="60"/>
-      </w:pPr>
-      <w:r/>
-      <w:r>
-        <w:rPr>
-          <w:b/>
-        </w:rPr>
-        <w:t>Pattern:</w:t>
-      </w:r>
-      <w:r>
-        <w:t xml:space="preserve"> Modular MVC-style design (`routes`, `controllers`, `services`, `middleware`).</w:t>
-      </w:r>
-    </w:p>
-    <w:p>
-      <w:pPr>
-        <w:pStyle w:val="ListBullet"/>
-        <w:spacing w:after="60"/>
-      </w:pPr>
-      <w:r/>
-      <w:r>
-        <w:rPr>
-          <w:b/>
-        </w:rPr>
-        <w:t>Orchestration:</w:t>
-      </w:r>
-      <w:r>
-        <w:t xml:space="preserve"> Custom Multi-Agent Orchestration pipeline simulating complex LLM and hardware interactions.</w:t>
-      </w:r>
-    </w:p>
-    <w:p>
-      <w:pPr>
-        <w:pStyle w:val="ListBullet"/>
-        <w:spacing w:after="60"/>
-      </w:pPr>
-      <w:r/>
-      <w:r>
-        <w:rPr>
-          <w:b/>
-        </w:rPr>
-        <w:t>Data Flow:</w:t>
-      </w:r>
-      <w:r>
-        <w:t xml:space="preserve"> RESTful API endpoints handling JSON payloads and multipart-form data for image uploads.</w:t>
-      </w:r>
-    </w:p>
-    <w:p>
-      <w:pPr>
-        <w:pStyle w:val="ListBullet"/>
-        <w:spacing w:after="60"/>
-      </w:pPr>
-      <w:r>
-        <w:t>--</w:t>
-      </w:r>
-    </w:p>
-    <w:p>
-      <w:pPr>
-        <w:spacing w:before="280" w:after="120"/>
-      </w:pPr>
-      <w:r>
-        <w:rPr>
-          <w:b/>
-          <w:color w:val="0F172A"/>
-          <w:sz w:val="30"/>
-        </w:rPr>
-        <w:t>3. The Multi-Agent Orchestration Engine</w:t>
-      </w:r>
-    </w:p>
-    <w:p>
-      <w:pPr>
-        <w:spacing w:after="120" w:line="276" w:lineRule="auto"/>
-      </w:pPr>
-      <w:r>
-        <w:t>The core of ArgoGuard AI's backend is a linear, multi-phase agent orchestration system. Each agent handles a specific domain of reasoning:</w:t>
-      </w:r>
-    </w:p>
-    <w:p>
-      <w:pPr>
-        <w:pStyle w:val="ListNumber"/>
-        <w:spacing w:after="60"/>
-      </w:pPr>
-      <w:r/>
-      <w:r>
-        <w:rPr>
-          <w:b/>
-        </w:rPr>
-        <w:t>Input Aggregation Agent:</w:t>
-      </w:r>
-      <w:r>
-        <w:t xml:space="preserve"> Collects inputs from the user (images) and local sensors/APIs (temperature, humidity, location).</w:t>
-      </w:r>
-    </w:p>
-    <w:p>
-      <w:pPr>
-        <w:pStyle w:val="ListNumber"/>
-        <w:spacing w:after="60"/>
-      </w:pPr>
-      <w:r/>
-      <w:r>
-        <w:rPr>
-          <w:b/>
-        </w:rPr>
-        <w:t>Disease Analysis Agent:</w:t>
-      </w:r>
-      <w:r>
-        <w:t xml:space="preserve"> Integrates with </w:t>
-      </w:r>
-      <w:r>
-        <w:rPr>
-          <w:b/>
-        </w:rPr>
-        <w:t>Google Gemini Vision AI</w:t>
-      </w:r>
-      <w:r>
-        <w:t xml:space="preserve"> to scan crop images, identify pathogens, determine confidence levels, and suggest immediate treatments.</w:t>
-      </w:r>
-    </w:p>
-    <w:p>
-      <w:pPr>
-        <w:pStyle w:val="ListNumber"/>
-        <w:spacing w:after="60"/>
-      </w:pPr>
-      <w:r/>
-      <w:r>
-        <w:rPr>
-          <w:b/>
-        </w:rPr>
-        <w:t>Risk Assessment Agent:</w:t>
-      </w:r>
-      <w:r>
-        <w:t xml:space="preserve"> Evaluates secondary risks. For example, if a highly contagious fungus is detected, it assesses the spread probability based on current wind and humidity.</w:t>
-      </w:r>
-    </w:p>
-    <w:p>
-      <w:pPr>
-        <w:pStyle w:val="ListNumber"/>
-        <w:spacing w:after="60"/>
-      </w:pPr>
-      <w:r/>
-      <w:r>
-        <w:rPr>
-          <w:b/>
-        </w:rPr>
-        <w:t>Constraint Planning Agent (Contradiction Resolution):</w:t>
-      </w:r>
-      <w:r>
-        <w:t xml:space="preserve"> Ensures safe operations. If the Disease Agent suggests pesticide spraying, but the Weather Agent detects high winds (&gt;20km/h), this agent *resolves the contradiction* by overriding the spray command and suggesting a safer alternative (e.g., localized drip treatment).</w:t>
-      </w:r>
-    </w:p>
-    <w:p>
-      <w:pPr>
-        <w:pStyle w:val="ListNumber"/>
-        <w:spacing w:after="60"/>
-      </w:pPr>
-      <w:r/>
-      <w:r>
-        <w:rPr>
-          <w:b/>
-        </w:rPr>
-        <w:t>Action Execution Agent:</w:t>
-      </w:r>
-      <w:r>
-        <w:t xml:space="preserve"> Interfaces with mocked hardware (IoT devices like valves or drones) to execute the planned treatment.</w:t>
-      </w:r>
-    </w:p>
-    <w:p>
-      <w:pPr>
-        <w:pStyle w:val="ListNumber"/>
-        <w:spacing w:after="60"/>
-      </w:pPr>
-      <w:r/>
-      <w:r>
-        <w:rPr>
-          <w:b/>
-        </w:rPr>
-        <w:t>Recovery Agent:</w:t>
-      </w:r>
-      <w:r>
-        <w:t xml:space="preserve"> Monitors execution. If an execution fails (e.g., "Connection drop or valve error"), this agent initiates a rapid </w:t>
-      </w:r>
-      <w:r>
-        <w:rPr>
-          <w:b/>
-        </w:rPr>
-        <w:t>Rollback Protocol</w:t>
-      </w:r>
-      <w:r>
-        <w:t>, resetting hardware states, preventing chemical leaks, and alerting the farmer.</w:t>
-      </w:r>
-    </w:p>
-    <w:p>
-      <w:pPr>
-        <w:pStyle w:val="ListBullet"/>
-        <w:spacing w:after="60"/>
-      </w:pPr>
-      <w:r>
-        <w:t>--</w:t>
-      </w:r>
-    </w:p>
-    <w:p>
-      <w:pPr>
-        <w:spacing w:before="280" w:after="120"/>
-      </w:pPr>
-      <w:r>
-        <w:rPr>
-          <w:b/>
-          <w:color w:val="0F172A"/>
-          <w:sz w:val="30"/>
-        </w:rPr>
-        <w:t>4. Real / Mock APIs and Integrations</w:t>
-      </w:r>
-    </w:p>
-    <w:p>
-      <w:pPr>
-        <w:spacing w:before="200" w:after="80"/>
-      </w:pPr>
-      <w:r>
-        <w:rPr>
-          <w:b/>
-          <w:color w:val="10B981"/>
-          <w:sz w:val="25"/>
-        </w:rPr>
-        <w:t>External Integrations (Real APIs)</w:t>
-      </w:r>
-    </w:p>
-    <w:p>
-      <w:pPr>
-        <w:pStyle w:val="ListBullet"/>
-        <w:spacing w:after="60"/>
-      </w:pPr>
-      <w:r/>
-      <w:r>
-        <w:rPr>
-          <w:b/>
-        </w:rPr>
-        <w:t>Open-Meteo API (Real-Time Weather):</w:t>
-      </w:r>
-      <w:r/>
-    </w:p>
-    <w:p>
-      <w:pPr>
-        <w:pStyle w:val="ListBullet"/>
-        <w:spacing w:after="60"/>
-      </w:pPr>
-      <w:r/>
-      <w:r>
-        <w:rPr>
-          <w:b/>
-        </w:rPr>
-        <w:t>Type:</w:t>
-      </w:r>
-      <w:r>
-        <w:t xml:space="preserve"> Real API (Keyless)</w:t>
-      </w:r>
-    </w:p>
-    <w:p>
-      <w:pPr>
-        <w:pStyle w:val="ListBullet"/>
-        <w:spacing w:after="60"/>
-      </w:pPr>
-      <w:r/>
-      <w:r>
-        <w:rPr>
-          <w:b/>
-        </w:rPr>
-        <w:t>Purpose:</w:t>
-      </w:r>
-      <w:r>
-        <w:t xml:space="preserve"> Fetches high-fidelity, real-time meteorological data (temperature, windspeed, rain probability) based on the client's precise latitude and longitude.</w:t>
-      </w:r>
-    </w:p>
-    <w:p>
-      <w:pPr>
-        <w:pStyle w:val="ListBullet"/>
-        <w:spacing w:after="60"/>
-      </w:pPr>
-      <w:r/>
-      <w:r>
-        <w:rPr>
-          <w:b/>
-        </w:rPr>
-        <w:t>Implementation:</w:t>
-      </w:r>
-      <w:r>
-        <w:t xml:space="preserve"> Custom Node.js service that translates WMO weather codes into human-readable descriptions and feeds data into the Constraint Planning Agent for weather-based agricultural recommendations.</w:t>
-      </w:r>
-    </w:p>
-    <w:p>
-      <w:pPr>
-        <w:pStyle w:val="ListBullet"/>
-        <w:spacing w:after="60"/>
-      </w:pPr>
-      <w:r/>
-      <w:r>
-        <w:rPr>
-          <w:b/>
-        </w:rPr>
-        <w:t>Google Gemini API (Vision):</w:t>
-      </w:r>
-      <w:r/>
-    </w:p>
-    <w:p>
-      <w:pPr>
-        <w:pStyle w:val="ListBullet"/>
-        <w:spacing w:after="60"/>
-      </w:pPr>
-      <w:r/>
-      <w:r>
-        <w:rPr>
-          <w:b/>
-        </w:rPr>
-        <w:t>Type:</w:t>
-      </w:r>
-      <w:r>
-        <w:t xml:space="preserve"> Real API</w:t>
-      </w:r>
-    </w:p>
-    <w:p>
-      <w:pPr>
-        <w:pStyle w:val="ListBullet"/>
-        <w:spacing w:after="60"/>
-      </w:pPr>
-      <w:r/>
-      <w:r>
-        <w:rPr>
-          <w:b/>
-        </w:rPr>
-        <w:t>Purpose:</w:t>
-      </w:r>
-      <w:r>
-        <w:t xml:space="preserve"> Analyzes uploaded crop images to diagnose diseases, identify crop types, and generate severity scores.</w:t>
-      </w:r>
-    </w:p>
-    <w:p>
-      <w:pPr>
-        <w:spacing w:before="200" w:after="80"/>
-      </w:pPr>
-      <w:r>
-        <w:rPr>
-          <w:b/>
-          <w:color w:val="10B981"/>
-          <w:sz w:val="25"/>
-        </w:rPr>
-        <w:t>Internal Endpoints (Mocked / Simulated Execution)</w:t>
-      </w:r>
-    </w:p>
-    <w:p>
-      <w:pPr>
-        <w:spacing w:after="120" w:line="276" w:lineRule="auto"/>
-      </w:pPr>
-      <w:r>
-        <w:t>To demonstrate complex IoT capabilities without requiring physical hardware, several components are heavily mocked with high-fidelity simulations:</w:t>
-      </w:r>
-    </w:p>
-    <w:p>
-      <w:pPr>
-        <w:pStyle w:val="ListBullet"/>
-        <w:spacing w:after="60"/>
-      </w:pPr>
-      <w:r/>
-      <w:r>
-        <w:rPr>
-          <w:b/>
-        </w:rPr>
-        <w:t>`POST /actions`</w:t>
-      </w:r>
-      <w:r>
-        <w:t>: Simulates the dispatch of physical hardware (e.g., Drone Spraying, Sprinkler Activation). It simulates network latency, connection drops, and hardware failures to trigger the Recovery Agent.</w:t>
-      </w:r>
-    </w:p>
-    <w:p>
-      <w:pPr>
-        <w:pStyle w:val="ListBullet"/>
-        <w:spacing w:after="60"/>
-      </w:pPr>
-      <w:r/>
-      <w:r>
-        <w:rPr>
-          <w:b/>
-        </w:rPr>
-        <w:t>`POST /auth/login`</w:t>
-      </w:r>
-      <w:r>
-        <w:t>: Simulates JWT-based authentication for demo users without requiring a live database connection.</w:t>
-      </w:r>
-    </w:p>
-    <w:p>
-      <w:pPr>
-        <w:pStyle w:val="ListBullet"/>
-        <w:spacing w:after="60"/>
-      </w:pPr>
-      <w:r/>
-      <w:r>
-        <w:rPr>
-          <w:b/>
-        </w:rPr>
-        <w:t>`GET /logs`</w:t>
-      </w:r>
-      <w:r>
-        <w:t>: Serves the step-by-step reasoning traces of all AI agents to the Flutter frontend so the farmer has full transparency into how a decision was made.</w:t>
-      </w:r>
-    </w:p>
-    <w:p>
-      <w:pPr>
-        <w:pStyle w:val="ListBullet"/>
-        <w:spacing w:after="60"/>
-      </w:pPr>
-      <w:r>
-        <w:t>--</w:t>
-      </w:r>
-    </w:p>
-    <w:p>
-      <w:pPr>
-        <w:spacing w:before="280" w:after="120"/>
-      </w:pPr>
-      <w:r>
-        <w:rPr>
-          <w:b/>
-          <w:color w:val="0F172A"/>
-          <w:sz w:val="30"/>
-        </w:rPr>
-        <w:t>5. Failure Recovery &amp; Failsafes</w:t>
-      </w:r>
-    </w:p>
-    <w:p>
-      <w:pPr>
-        <w:spacing w:after="120" w:line="276" w:lineRule="auto"/>
-      </w:pPr>
-      <w:r>
-        <w:t xml:space="preserve">In an agricultural setting, an AI making a mistake (like over-watering or dumping excessive pesticide) can destroy a harvest. ArgoGuard AI emphasizes </w:t>
-      </w:r>
-      <w:r>
-        <w:rPr>
-          <w:b/>
-        </w:rPr>
-        <w:t>Safe AI</w:t>
-      </w:r>
-      <w:r>
-        <w:t>:</w:t>
-      </w:r>
-    </w:p>
-    <w:p>
-      <w:pPr>
-        <w:pStyle w:val="ListBullet"/>
-        <w:spacing w:after="60"/>
-      </w:pPr>
-      <w:r/>
-      <w:r>
-        <w:rPr>
-          <w:b/>
-        </w:rPr>
-        <w:t>Graceful Degradation:</w:t>
-      </w:r>
-      <w:r>
-        <w:t xml:space="preserve"> If the backend weather API fails, the Flutter app instantly falls back to an offline mock state to prevent the UI from crashing.</w:t>
-      </w:r>
-    </w:p>
-    <w:p>
-      <w:pPr>
-        <w:pStyle w:val="ListBullet"/>
-        <w:spacing w:after="60"/>
-      </w:pPr>
-      <w:r/>
-      <w:r>
-        <w:rPr>
-          <w:b/>
-        </w:rPr>
-        <w:t>Terminal Rollbacks:</w:t>
-      </w:r>
-      <w:r>
-        <w:t xml:space="preserve"> If the `Action Execution Agent` attempts to spray crops but fails 3 times due to simulated connection drops, the `Recovery Agent` steps in. It logs a `[ROLLBACK]` event, mathematically resets simulated chemical reservoirs to prevent double-dosing, and triggers an emergency push notification to the farmer's dashboard.</w:t>
-      </w:r>
-    </w:p>
-    <w:p>
-      <w:pPr>
-        <w:pStyle w:val="ListBullet"/>
-        <w:spacing w:after="60"/>
-      </w:pPr>
-      <w:r>
-        <w:t>--</w:t>
-      </w:r>
-    </w:p>
-    <w:p>
-      <w:pPr>
-        <w:spacing w:before="280" w:after="120"/>
-      </w:pPr>
-      <w:r>
-        <w:rPr>
-          <w:b/>
-          <w:color w:val="0F172A"/>
-          <w:sz w:val="30"/>
-        </w:rPr>
-        <w:t>Summary</w:t>
-      </w:r>
-    </w:p>
-    <w:p>
-      <w:pPr>
-        <w:spacing w:after="120" w:line="276" w:lineRule="auto"/>
-      </w:pPr>
-      <w:r>
-        <w:t xml:space="preserve">ArgoGuard AI is not a simple wrapper around an LLM. It is a comprehensive </w:t>
-      </w:r>
-      <w:r>
-        <w:rPr>
-          <w:b/>
-        </w:rPr>
-        <w:t>Agentic Workflow</w:t>
-      </w:r>
-      <w:r>
-        <w:t xml:space="preserve"> that processes visual data, correlates it with real-time environmental APIs, plans hardware-safe actions, resolves logical contradictions, and guarantees hardware safety through automated rollbacks.</w:t>
+        <w:t>ArgoGuard AI provides a highly advanced, secure, and production-ready architecture. By modularizing crop pathology scanning and multi-agent reasoning, the system easily absorbs new sensor feeds, actuator drivers, and cloud intelligence models. Backed by strict constraint auditing, automatic retries, and transactional rollbacks, ArgoGuard AI sets a new standard of reliability for the future of digital farming.</w:t>
       </w:r>
     </w:p>
     <w:sectPr>
@@ -1279,9 +4031,9 @@
     <w:qFormat/>
     <w:rsid w:val="00FC693F"/>
     <w:rPr>
-      <w:rFonts w:ascii="Arial" w:hAnsi="Arial"/>
-      <w:color w:val="2D3748"/>
-      <w:sz w:val="22"/>
+      <w:rFonts w:ascii="Calibri" w:hAnsi="Calibri"/>
+      <w:color w:val="212121"/>
+      <w:sz w:val="21"/>
     </w:rPr>
   </w:style>
   <w:style w:type="paragraph" w:styleId="Header">

</xml_diff>